<commit_message>
v0.3 Modificare diagrame / word
</commit_message>
<xml_diff>
--- a/docs/Documentatie proiect.docx
+++ b/docs/Documentatie proiect.docx
@@ -29,6 +29,7 @@
         </w:rPr>
       </w:pPr>
       <w:bookmarkStart w:id="0" w:name="_Toc242908329"/>
+      <w:proofErr w:type="spellStart"/>
       <w:r>
         <w:rPr>
           <w:rFonts w:ascii="Times New Roman" w:hAnsi="Times New Roman" w:cs="Times New Roman"/>
@@ -38,6 +39,7 @@
         </w:rPr>
         <w:t>Aplica</w:t>
       </w:r>
+      <w:proofErr w:type="spellEnd"/>
       <w:r>
         <w:rPr>
           <w:rFonts w:ascii="Times New Roman" w:hAnsi="Times New Roman" w:cs="Times New Roman"/>
@@ -162,49 +164,141 @@
           <w:szCs w:val="36"/>
         </w:rPr>
       </w:pPr>
+      <w:proofErr w:type="gramStart"/>
       <w:r>
         <w:rPr>
           <w:rFonts w:ascii="Times New Roman" w:hAnsi="Times New Roman" w:cs="Times New Roman"/>
           <w:sz w:val="36"/>
           <w:szCs w:val="36"/>
         </w:rPr>
-        <w:t>An studențesc: al III-a</w:t>
-      </w:r>
-    </w:p>
-    <w:p>
-      <w:pPr>
-        <w:spacing w:before="30"/>
+        <w:t>An</w:t>
+      </w:r>
+      <w:proofErr w:type="gramEnd"/>
+      <w:r>
         <w:rPr>
           <w:rFonts w:ascii="Times New Roman" w:hAnsi="Times New Roman" w:cs="Times New Roman"/>
           <w:sz w:val="36"/>
           <w:szCs w:val="36"/>
         </w:rPr>
-      </w:pPr>
+        <w:t xml:space="preserve"> </w:t>
+      </w:r>
+      <w:proofErr w:type="spellStart"/>
       <w:r>
         <w:rPr>
           <w:rFonts w:ascii="Times New Roman" w:hAnsi="Times New Roman" w:cs="Times New Roman"/>
           <w:sz w:val="36"/>
           <w:szCs w:val="36"/>
         </w:rPr>
-        <w:t>Grupa: I</w:t>
-      </w:r>
-    </w:p>
-    <w:p>
-      <w:pPr>
-        <w:spacing w:before="30"/>
+        <w:t>studențesc</w:t>
+      </w:r>
+      <w:proofErr w:type="spellEnd"/>
+      <w:r>
         <w:rPr>
           <w:rFonts w:ascii="Times New Roman" w:hAnsi="Times New Roman" w:cs="Times New Roman"/>
           <w:sz w:val="36"/>
           <w:szCs w:val="36"/>
         </w:rPr>
-      </w:pPr>
+        <w:t xml:space="preserve">: </w:t>
+      </w:r>
+      <w:proofErr w:type="gramStart"/>
       <w:r>
         <w:rPr>
           <w:rFonts w:ascii="Times New Roman" w:hAnsi="Times New Roman" w:cs="Times New Roman"/>
           <w:sz w:val="36"/>
           <w:szCs w:val="36"/>
         </w:rPr>
-        <w:t>Materie: Proiectarea Bazelor de Date</w:t>
+        <w:t>al</w:t>
+      </w:r>
+      <w:proofErr w:type="gramEnd"/>
+      <w:r>
+        <w:rPr>
+          <w:rFonts w:ascii="Times New Roman" w:hAnsi="Times New Roman" w:cs="Times New Roman"/>
+          <w:sz w:val="36"/>
+          <w:szCs w:val="36"/>
+        </w:rPr>
+        <w:t xml:space="preserve"> III-a</w:t>
+      </w:r>
+    </w:p>
+    <w:p>
+      <w:pPr>
+        <w:spacing w:before="30"/>
+        <w:rPr>
+          <w:rFonts w:ascii="Times New Roman" w:hAnsi="Times New Roman" w:cs="Times New Roman"/>
+          <w:sz w:val="36"/>
+          <w:szCs w:val="36"/>
+        </w:rPr>
+      </w:pPr>
+      <w:r>
+        <w:rPr>
+          <w:rFonts w:ascii="Times New Roman" w:hAnsi="Times New Roman" w:cs="Times New Roman"/>
+          <w:sz w:val="36"/>
+          <w:szCs w:val="36"/>
+        </w:rPr>
+        <w:t>Grupa: I</w:t>
+      </w:r>
+    </w:p>
+    <w:p>
+      <w:pPr>
+        <w:spacing w:before="30"/>
+        <w:rPr>
+          <w:rFonts w:ascii="Times New Roman" w:hAnsi="Times New Roman" w:cs="Times New Roman"/>
+          <w:sz w:val="36"/>
+          <w:szCs w:val="36"/>
+        </w:rPr>
+      </w:pPr>
+      <w:proofErr w:type="spellStart"/>
+      <w:r>
+        <w:rPr>
+          <w:rFonts w:ascii="Times New Roman" w:hAnsi="Times New Roman" w:cs="Times New Roman"/>
+          <w:sz w:val="36"/>
+          <w:szCs w:val="36"/>
+        </w:rPr>
+        <w:t>Materie</w:t>
+      </w:r>
+      <w:proofErr w:type="spellEnd"/>
+      <w:r>
+        <w:rPr>
+          <w:rFonts w:ascii="Times New Roman" w:hAnsi="Times New Roman" w:cs="Times New Roman"/>
+          <w:sz w:val="36"/>
+          <w:szCs w:val="36"/>
+        </w:rPr>
+        <w:t xml:space="preserve">: </w:t>
+      </w:r>
+      <w:proofErr w:type="spellStart"/>
+      <w:r>
+        <w:rPr>
+          <w:rFonts w:ascii="Times New Roman" w:hAnsi="Times New Roman" w:cs="Times New Roman"/>
+          <w:sz w:val="36"/>
+          <w:szCs w:val="36"/>
+        </w:rPr>
+        <w:t>Proiectarea</w:t>
+      </w:r>
+      <w:proofErr w:type="spellEnd"/>
+      <w:r>
+        <w:rPr>
+          <w:rFonts w:ascii="Times New Roman" w:hAnsi="Times New Roman" w:cs="Times New Roman"/>
+          <w:sz w:val="36"/>
+          <w:szCs w:val="36"/>
+        </w:rPr>
+        <w:t xml:space="preserve"> </w:t>
+      </w:r>
+      <w:proofErr w:type="spellStart"/>
+      <w:r>
+        <w:rPr>
+          <w:rFonts w:ascii="Times New Roman" w:hAnsi="Times New Roman" w:cs="Times New Roman"/>
+          <w:sz w:val="36"/>
+          <w:szCs w:val="36"/>
+        </w:rPr>
+        <w:t>Bazelor</w:t>
+      </w:r>
+      <w:proofErr w:type="spellEnd"/>
+      <w:r>
+        <w:rPr>
+          <w:rFonts w:ascii="Times New Roman" w:hAnsi="Times New Roman" w:cs="Times New Roman"/>
+          <w:sz w:val="36"/>
+          <w:szCs w:val="36"/>
+        </w:rPr>
+        <w:t xml:space="preserve"> de Date</w:t>
       </w:r>
     </w:p>
     <w:p>
@@ -216,13 +310,41 @@
           <w:lang w:val="ro-RO"/>
         </w:rPr>
       </w:pPr>
+      <w:proofErr w:type="spellStart"/>
       <w:r>
         <w:rPr>
           <w:rFonts w:ascii="Times New Roman" w:hAnsi="Times New Roman" w:cs="Times New Roman"/>
           <w:sz w:val="36"/>
           <w:szCs w:val="36"/>
         </w:rPr>
-        <w:t>Profesor îndrumător: V</w:t>
+        <w:t>Profesor</w:t>
+      </w:r>
+      <w:proofErr w:type="spellEnd"/>
+      <w:r>
+        <w:rPr>
+          <w:rFonts w:ascii="Times New Roman" w:hAnsi="Times New Roman" w:cs="Times New Roman"/>
+          <w:sz w:val="36"/>
+          <w:szCs w:val="36"/>
+        </w:rPr>
+        <w:t xml:space="preserve"> </w:t>
+      </w:r>
+      <w:proofErr w:type="spellStart"/>
+      <w:r>
+        <w:rPr>
+          <w:rFonts w:ascii="Times New Roman" w:hAnsi="Times New Roman" w:cs="Times New Roman"/>
+          <w:sz w:val="36"/>
+          <w:szCs w:val="36"/>
+        </w:rPr>
+        <w:t>îndrumător</w:t>
+      </w:r>
+      <w:proofErr w:type="spellEnd"/>
+      <w:r>
+        <w:rPr>
+          <w:rFonts w:ascii="Times New Roman" w:hAnsi="Times New Roman" w:cs="Times New Roman"/>
+          <w:sz w:val="36"/>
+          <w:szCs w:val="36"/>
+        </w:rPr>
+        <w:t>: V</w:t>
       </w:r>
       <w:r>
         <w:rPr>
@@ -347,6 +469,7 @@
               <w:szCs w:val="44"/>
             </w:rPr>
           </w:pPr>
+          <w:proofErr w:type="spellStart"/>
           <w:r>
             <w:rPr>
               <w:rFonts w:ascii="Times New Roman" w:hAnsi="Times New Roman" w:cs="Times New Roman"/>
@@ -355,6 +478,7 @@
             </w:rPr>
             <w:t>Cuprins</w:t>
           </w:r>
+          <w:proofErr w:type="spellEnd"/>
         </w:p>
         <w:p>
           <w:pPr>
@@ -673,6 +797,7 @@
         </w:rPr>
       </w:pPr>
       <w:bookmarkStart w:id="1" w:name="_Toc242908330"/>
+      <w:proofErr w:type="spellStart"/>
       <w:r>
         <w:rPr>
           <w:rFonts w:ascii="Times New Roman" w:hAnsi="Times New Roman" w:cs="Times New Roman"/>
@@ -680,9 +805,46 @@
           <w:szCs w:val="44"/>
         </w:rPr>
         <w:lastRenderedPageBreak/>
-        <w:t>Scopul și Obiectivele</w:t>
+        <w:t>Scopul</w:t>
+      </w:r>
+      <w:proofErr w:type="spellEnd"/>
+      <w:r>
+        <w:rPr>
+          <w:rFonts w:ascii="Times New Roman" w:hAnsi="Times New Roman" w:cs="Times New Roman"/>
+          <w:sz w:val="44"/>
+          <w:szCs w:val="44"/>
+        </w:rPr>
+        <w:t xml:space="preserve"> </w:t>
+      </w:r>
+      <w:proofErr w:type="spellStart"/>
+      <w:r>
+        <w:rPr>
+          <w:rFonts w:ascii="Times New Roman" w:hAnsi="Times New Roman" w:cs="Times New Roman"/>
+          <w:sz w:val="44"/>
+          <w:szCs w:val="44"/>
+        </w:rPr>
+        <w:t>și</w:t>
+      </w:r>
+      <w:proofErr w:type="spellEnd"/>
+      <w:r>
+        <w:rPr>
+          <w:rFonts w:ascii="Times New Roman" w:hAnsi="Times New Roman" w:cs="Times New Roman"/>
+          <w:sz w:val="44"/>
+          <w:szCs w:val="44"/>
+        </w:rPr>
+        <w:t xml:space="preserve"> </w:t>
+      </w:r>
+      <w:proofErr w:type="spellStart"/>
+      <w:r>
+        <w:rPr>
+          <w:rFonts w:ascii="Times New Roman" w:hAnsi="Times New Roman" w:cs="Times New Roman"/>
+          <w:sz w:val="44"/>
+          <w:szCs w:val="44"/>
+        </w:rPr>
+        <w:t>Obiectivele</w:t>
       </w:r>
       <w:bookmarkEnd w:id="1"/>
+      <w:proofErr w:type="spellEnd"/>
     </w:p>
     <w:p>
       <w:pPr>
@@ -738,13 +900,257 @@
           <w:szCs w:val="28"/>
         </w:rPr>
       </w:pPr>
-      <w:r>
-        <w:rPr>
-          <w:rFonts w:ascii="Times New Roman" w:hAnsi="Times New Roman" w:cs="Times New Roman"/>
-          <w:sz w:val="28"/>
-          <w:szCs w:val="28"/>
-        </w:rPr>
-        <w:t xml:space="preserve">Proiectul își propune digitalizarea proceselor operaționale dintr-un târg auto fizic, având o capacitate fixă de 40 de locuri de parcare. </w:t>
+      <w:proofErr w:type="spellStart"/>
+      <w:r>
+        <w:rPr>
+          <w:rFonts w:ascii="Times New Roman" w:hAnsi="Times New Roman" w:cs="Times New Roman"/>
+          <w:sz w:val="28"/>
+          <w:szCs w:val="28"/>
+        </w:rPr>
+        <w:t>Proiectul</w:t>
+      </w:r>
+      <w:proofErr w:type="spellEnd"/>
+      <w:r>
+        <w:rPr>
+          <w:rFonts w:ascii="Times New Roman" w:hAnsi="Times New Roman" w:cs="Times New Roman"/>
+          <w:sz w:val="28"/>
+          <w:szCs w:val="28"/>
+        </w:rPr>
+        <w:t xml:space="preserve"> </w:t>
+      </w:r>
+      <w:proofErr w:type="spellStart"/>
+      <w:r>
+        <w:rPr>
+          <w:rFonts w:ascii="Times New Roman" w:hAnsi="Times New Roman" w:cs="Times New Roman"/>
+          <w:sz w:val="28"/>
+          <w:szCs w:val="28"/>
+        </w:rPr>
+        <w:t>își</w:t>
+      </w:r>
+      <w:proofErr w:type="spellEnd"/>
+      <w:r>
+        <w:rPr>
+          <w:rFonts w:ascii="Times New Roman" w:hAnsi="Times New Roman" w:cs="Times New Roman"/>
+          <w:sz w:val="28"/>
+          <w:szCs w:val="28"/>
+        </w:rPr>
+        <w:t xml:space="preserve"> </w:t>
+      </w:r>
+      <w:proofErr w:type="spellStart"/>
+      <w:r>
+        <w:rPr>
+          <w:rFonts w:ascii="Times New Roman" w:hAnsi="Times New Roman" w:cs="Times New Roman"/>
+          <w:sz w:val="28"/>
+          <w:szCs w:val="28"/>
+        </w:rPr>
+        <w:t>propune</w:t>
+      </w:r>
+      <w:proofErr w:type="spellEnd"/>
+      <w:r>
+        <w:rPr>
+          <w:rFonts w:ascii="Times New Roman" w:hAnsi="Times New Roman" w:cs="Times New Roman"/>
+          <w:sz w:val="28"/>
+          <w:szCs w:val="28"/>
+        </w:rPr>
+        <w:t xml:space="preserve"> </w:t>
+      </w:r>
+      <w:proofErr w:type="spellStart"/>
+      <w:r>
+        <w:rPr>
+          <w:rFonts w:ascii="Times New Roman" w:hAnsi="Times New Roman" w:cs="Times New Roman"/>
+          <w:sz w:val="28"/>
+          <w:szCs w:val="28"/>
+        </w:rPr>
+        <w:t>digitalizarea</w:t>
+      </w:r>
+      <w:proofErr w:type="spellEnd"/>
+      <w:r>
+        <w:rPr>
+          <w:rFonts w:ascii="Times New Roman" w:hAnsi="Times New Roman" w:cs="Times New Roman"/>
+          <w:sz w:val="28"/>
+          <w:szCs w:val="28"/>
+        </w:rPr>
+        <w:t xml:space="preserve"> </w:t>
+      </w:r>
+      <w:proofErr w:type="spellStart"/>
+      <w:r>
+        <w:rPr>
+          <w:rFonts w:ascii="Times New Roman" w:hAnsi="Times New Roman" w:cs="Times New Roman"/>
+          <w:sz w:val="28"/>
+          <w:szCs w:val="28"/>
+        </w:rPr>
+        <w:t>proceselor</w:t>
+      </w:r>
+      <w:proofErr w:type="spellEnd"/>
+      <w:r>
+        <w:rPr>
+          <w:rFonts w:ascii="Times New Roman" w:hAnsi="Times New Roman" w:cs="Times New Roman"/>
+          <w:sz w:val="28"/>
+          <w:szCs w:val="28"/>
+        </w:rPr>
+        <w:t xml:space="preserve"> </w:t>
+      </w:r>
+      <w:proofErr w:type="spellStart"/>
+      <w:r>
+        <w:rPr>
+          <w:rFonts w:ascii="Times New Roman" w:hAnsi="Times New Roman" w:cs="Times New Roman"/>
+          <w:sz w:val="28"/>
+          <w:szCs w:val="28"/>
+        </w:rPr>
+        <w:t>operaționale</w:t>
+      </w:r>
+      <w:proofErr w:type="spellEnd"/>
+      <w:r>
+        <w:rPr>
+          <w:rFonts w:ascii="Times New Roman" w:hAnsi="Times New Roman" w:cs="Times New Roman"/>
+          <w:sz w:val="28"/>
+          <w:szCs w:val="28"/>
+        </w:rPr>
+        <w:t xml:space="preserve"> </w:t>
+      </w:r>
+      <w:proofErr w:type="spellStart"/>
+      <w:r>
+        <w:rPr>
+          <w:rFonts w:ascii="Times New Roman" w:hAnsi="Times New Roman" w:cs="Times New Roman"/>
+          <w:sz w:val="28"/>
+          <w:szCs w:val="28"/>
+        </w:rPr>
+        <w:t>dintr</w:t>
+      </w:r>
+      <w:proofErr w:type="spellEnd"/>
+      <w:r>
+        <w:rPr>
+          <w:rFonts w:ascii="Times New Roman" w:hAnsi="Times New Roman" w:cs="Times New Roman"/>
+          <w:sz w:val="28"/>
+          <w:szCs w:val="28"/>
+        </w:rPr>
+        <w:t xml:space="preserve">-un </w:t>
+      </w:r>
+      <w:proofErr w:type="spellStart"/>
+      <w:r>
+        <w:rPr>
+          <w:rFonts w:ascii="Times New Roman" w:hAnsi="Times New Roman" w:cs="Times New Roman"/>
+          <w:sz w:val="28"/>
+          <w:szCs w:val="28"/>
+        </w:rPr>
+        <w:t>târg</w:t>
+      </w:r>
+      <w:proofErr w:type="spellEnd"/>
+      <w:r>
+        <w:rPr>
+          <w:rFonts w:ascii="Times New Roman" w:hAnsi="Times New Roman" w:cs="Times New Roman"/>
+          <w:sz w:val="28"/>
+          <w:szCs w:val="28"/>
+        </w:rPr>
+        <w:t xml:space="preserve"> auto </w:t>
+      </w:r>
+      <w:proofErr w:type="spellStart"/>
+      <w:r>
+        <w:rPr>
+          <w:rFonts w:ascii="Times New Roman" w:hAnsi="Times New Roman" w:cs="Times New Roman"/>
+          <w:sz w:val="28"/>
+          <w:szCs w:val="28"/>
+        </w:rPr>
+        <w:t>fizic</w:t>
+      </w:r>
+      <w:proofErr w:type="spellEnd"/>
+      <w:r>
+        <w:rPr>
+          <w:rFonts w:ascii="Times New Roman" w:hAnsi="Times New Roman" w:cs="Times New Roman"/>
+          <w:sz w:val="28"/>
+          <w:szCs w:val="28"/>
+        </w:rPr>
+        <w:t xml:space="preserve">, </w:t>
+      </w:r>
+      <w:proofErr w:type="spellStart"/>
+      <w:r>
+        <w:rPr>
+          <w:rFonts w:ascii="Times New Roman" w:hAnsi="Times New Roman" w:cs="Times New Roman"/>
+          <w:sz w:val="28"/>
+          <w:szCs w:val="28"/>
+        </w:rPr>
+        <w:t>având</w:t>
+      </w:r>
+      <w:proofErr w:type="spellEnd"/>
+      <w:r>
+        <w:rPr>
+          <w:rFonts w:ascii="Times New Roman" w:hAnsi="Times New Roman" w:cs="Times New Roman"/>
+          <w:sz w:val="28"/>
+          <w:szCs w:val="28"/>
+        </w:rPr>
+        <w:t xml:space="preserve"> o </w:t>
+      </w:r>
+      <w:proofErr w:type="gramStart"/>
+      <w:r>
+        <w:rPr>
+          <w:rFonts w:ascii="Times New Roman" w:hAnsi="Times New Roman" w:cs="Times New Roman"/>
+          <w:sz w:val="28"/>
+          <w:szCs w:val="28"/>
+        </w:rPr>
+        <w:t>capacitate</w:t>
+      </w:r>
+      <w:proofErr w:type="gramEnd"/>
+      <w:r>
+        <w:rPr>
+          <w:rFonts w:ascii="Times New Roman" w:hAnsi="Times New Roman" w:cs="Times New Roman"/>
+          <w:sz w:val="28"/>
+          <w:szCs w:val="28"/>
+        </w:rPr>
+        <w:t xml:space="preserve"> </w:t>
+      </w:r>
+      <w:proofErr w:type="spellStart"/>
+      <w:r>
+        <w:rPr>
+          <w:rFonts w:ascii="Times New Roman" w:hAnsi="Times New Roman" w:cs="Times New Roman"/>
+          <w:sz w:val="28"/>
+          <w:szCs w:val="28"/>
+        </w:rPr>
+        <w:t>fixă</w:t>
+      </w:r>
+      <w:proofErr w:type="spellEnd"/>
+      <w:r>
+        <w:rPr>
+          <w:rFonts w:ascii="Times New Roman" w:hAnsi="Times New Roman" w:cs="Times New Roman"/>
+          <w:sz w:val="28"/>
+          <w:szCs w:val="28"/>
+        </w:rPr>
+        <w:t xml:space="preserve"> de 40 de </w:t>
+      </w:r>
+      <w:proofErr w:type="spellStart"/>
+      <w:r>
+        <w:rPr>
+          <w:rFonts w:ascii="Times New Roman" w:hAnsi="Times New Roman" w:cs="Times New Roman"/>
+          <w:sz w:val="28"/>
+          <w:szCs w:val="28"/>
+        </w:rPr>
+        <w:t>locuri</w:t>
+      </w:r>
+      <w:proofErr w:type="spellEnd"/>
+      <w:r>
+        <w:rPr>
+          <w:rFonts w:ascii="Times New Roman" w:hAnsi="Times New Roman" w:cs="Times New Roman"/>
+          <w:sz w:val="28"/>
+          <w:szCs w:val="28"/>
+        </w:rPr>
+        <w:t xml:space="preserve"> de </w:t>
+      </w:r>
+      <w:proofErr w:type="spellStart"/>
+      <w:r>
+        <w:rPr>
+          <w:rFonts w:ascii="Times New Roman" w:hAnsi="Times New Roman" w:cs="Times New Roman"/>
+          <w:sz w:val="28"/>
+          <w:szCs w:val="28"/>
+        </w:rPr>
+        <w:t>parcare</w:t>
+      </w:r>
+      <w:proofErr w:type="spellEnd"/>
+      <w:r>
+        <w:rPr>
+          <w:rFonts w:ascii="Times New Roman" w:hAnsi="Times New Roman" w:cs="Times New Roman"/>
+          <w:sz w:val="28"/>
+          <w:szCs w:val="28"/>
+        </w:rPr>
+        <w:t xml:space="preserve">. </w:t>
       </w:r>
     </w:p>
     <w:p>
@@ -756,13 +1162,545 @@
           <w:szCs w:val="28"/>
         </w:rPr>
       </w:pPr>
-      <w:r>
-        <w:rPr>
-          <w:rFonts w:ascii="Times New Roman" w:hAnsi="Times New Roman" w:cs="Times New Roman"/>
-          <w:sz w:val="28"/>
-          <w:szCs w:val="28"/>
-        </w:rPr>
-        <w:t>Scopul principal este dezvoltarea unei aplicații web integrate cu o bază de date relațională, care să faciliteze interacțiunea dintre vizitatorii interesați de achiziționarea unor autovehicule și clienții care doresc să își expună mașinile spre vânzare, contracost, în cadrul spațiului fizic.</w:t>
+      <w:proofErr w:type="spellStart"/>
+      <w:r>
+        <w:rPr>
+          <w:rFonts w:ascii="Times New Roman" w:hAnsi="Times New Roman" w:cs="Times New Roman"/>
+          <w:sz w:val="28"/>
+          <w:szCs w:val="28"/>
+        </w:rPr>
+        <w:t>Scopul</w:t>
+      </w:r>
+      <w:proofErr w:type="spellEnd"/>
+      <w:r>
+        <w:rPr>
+          <w:rFonts w:ascii="Times New Roman" w:hAnsi="Times New Roman" w:cs="Times New Roman"/>
+          <w:sz w:val="28"/>
+          <w:szCs w:val="28"/>
+        </w:rPr>
+        <w:t xml:space="preserve"> principal </w:t>
+      </w:r>
+      <w:proofErr w:type="spellStart"/>
+      <w:r>
+        <w:rPr>
+          <w:rFonts w:ascii="Times New Roman" w:hAnsi="Times New Roman" w:cs="Times New Roman"/>
+          <w:sz w:val="28"/>
+          <w:szCs w:val="28"/>
+        </w:rPr>
+        <w:t>este</w:t>
+      </w:r>
+      <w:proofErr w:type="spellEnd"/>
+      <w:r>
+        <w:rPr>
+          <w:rFonts w:ascii="Times New Roman" w:hAnsi="Times New Roman" w:cs="Times New Roman"/>
+          <w:sz w:val="28"/>
+          <w:szCs w:val="28"/>
+        </w:rPr>
+        <w:t xml:space="preserve"> </w:t>
+      </w:r>
+      <w:proofErr w:type="spellStart"/>
+      <w:r>
+        <w:rPr>
+          <w:rFonts w:ascii="Times New Roman" w:hAnsi="Times New Roman" w:cs="Times New Roman"/>
+          <w:sz w:val="28"/>
+          <w:szCs w:val="28"/>
+        </w:rPr>
+        <w:t>dezvoltarea</w:t>
+      </w:r>
+      <w:proofErr w:type="spellEnd"/>
+      <w:r>
+        <w:rPr>
+          <w:rFonts w:ascii="Times New Roman" w:hAnsi="Times New Roman" w:cs="Times New Roman"/>
+          <w:sz w:val="28"/>
+          <w:szCs w:val="28"/>
+        </w:rPr>
+        <w:t xml:space="preserve"> </w:t>
+      </w:r>
+      <w:proofErr w:type="spellStart"/>
+      <w:r>
+        <w:rPr>
+          <w:rFonts w:ascii="Times New Roman" w:hAnsi="Times New Roman" w:cs="Times New Roman"/>
+          <w:sz w:val="28"/>
+          <w:szCs w:val="28"/>
+        </w:rPr>
+        <w:t>unei</w:t>
+      </w:r>
+      <w:proofErr w:type="spellEnd"/>
+      <w:r>
+        <w:rPr>
+          <w:rFonts w:ascii="Times New Roman" w:hAnsi="Times New Roman" w:cs="Times New Roman"/>
+          <w:sz w:val="28"/>
+          <w:szCs w:val="28"/>
+        </w:rPr>
+        <w:t xml:space="preserve"> </w:t>
+      </w:r>
+      <w:proofErr w:type="spellStart"/>
+      <w:r>
+        <w:rPr>
+          <w:rFonts w:ascii="Times New Roman" w:hAnsi="Times New Roman" w:cs="Times New Roman"/>
+          <w:sz w:val="28"/>
+          <w:szCs w:val="28"/>
+        </w:rPr>
+        <w:t>aplicații</w:t>
+      </w:r>
+      <w:proofErr w:type="spellEnd"/>
+      <w:r>
+        <w:rPr>
+          <w:rFonts w:ascii="Times New Roman" w:hAnsi="Times New Roman" w:cs="Times New Roman"/>
+          <w:sz w:val="28"/>
+          <w:szCs w:val="28"/>
+        </w:rPr>
+        <w:t xml:space="preserve"> web integrate cu o </w:t>
+      </w:r>
+      <w:proofErr w:type="spellStart"/>
+      <w:r>
+        <w:rPr>
+          <w:rFonts w:ascii="Times New Roman" w:hAnsi="Times New Roman" w:cs="Times New Roman"/>
+          <w:sz w:val="28"/>
+          <w:szCs w:val="28"/>
+        </w:rPr>
+        <w:t>bază</w:t>
+      </w:r>
+      <w:proofErr w:type="spellEnd"/>
+      <w:r>
+        <w:rPr>
+          <w:rFonts w:ascii="Times New Roman" w:hAnsi="Times New Roman" w:cs="Times New Roman"/>
+          <w:sz w:val="28"/>
+          <w:szCs w:val="28"/>
+        </w:rPr>
+        <w:t xml:space="preserve"> de date </w:t>
+      </w:r>
+      <w:proofErr w:type="spellStart"/>
+      <w:r>
+        <w:rPr>
+          <w:rFonts w:ascii="Times New Roman" w:hAnsi="Times New Roman" w:cs="Times New Roman"/>
+          <w:sz w:val="28"/>
+          <w:szCs w:val="28"/>
+        </w:rPr>
+        <w:t>relațională</w:t>
+      </w:r>
+      <w:proofErr w:type="spellEnd"/>
+      <w:r>
+        <w:rPr>
+          <w:rFonts w:ascii="Times New Roman" w:hAnsi="Times New Roman" w:cs="Times New Roman"/>
+          <w:sz w:val="28"/>
+          <w:szCs w:val="28"/>
+        </w:rPr>
+        <w:t xml:space="preserve">, care </w:t>
+      </w:r>
+      <w:proofErr w:type="spellStart"/>
+      <w:r>
+        <w:rPr>
+          <w:rFonts w:ascii="Times New Roman" w:hAnsi="Times New Roman" w:cs="Times New Roman"/>
+          <w:sz w:val="28"/>
+          <w:szCs w:val="28"/>
+        </w:rPr>
+        <w:t>să</w:t>
+      </w:r>
+      <w:proofErr w:type="spellEnd"/>
+      <w:r>
+        <w:rPr>
+          <w:rFonts w:ascii="Times New Roman" w:hAnsi="Times New Roman" w:cs="Times New Roman"/>
+          <w:sz w:val="28"/>
+          <w:szCs w:val="28"/>
+        </w:rPr>
+        <w:t xml:space="preserve"> </w:t>
+      </w:r>
+      <w:proofErr w:type="spellStart"/>
+      <w:r>
+        <w:rPr>
+          <w:rFonts w:ascii="Times New Roman" w:hAnsi="Times New Roman" w:cs="Times New Roman"/>
+          <w:sz w:val="28"/>
+          <w:szCs w:val="28"/>
+        </w:rPr>
+        <w:t>faciliteze</w:t>
+      </w:r>
+      <w:proofErr w:type="spellEnd"/>
+      <w:r>
+        <w:rPr>
+          <w:rFonts w:ascii="Times New Roman" w:hAnsi="Times New Roman" w:cs="Times New Roman"/>
+          <w:sz w:val="28"/>
+          <w:szCs w:val="28"/>
+        </w:rPr>
+        <w:t xml:space="preserve"> </w:t>
+      </w:r>
+      <w:proofErr w:type="spellStart"/>
+      <w:r>
+        <w:rPr>
+          <w:rFonts w:ascii="Times New Roman" w:hAnsi="Times New Roman" w:cs="Times New Roman"/>
+          <w:sz w:val="28"/>
+          <w:szCs w:val="28"/>
+        </w:rPr>
+        <w:t>interacțiunea</w:t>
+      </w:r>
+      <w:proofErr w:type="spellEnd"/>
+      <w:r>
+        <w:rPr>
+          <w:rFonts w:ascii="Times New Roman" w:hAnsi="Times New Roman" w:cs="Times New Roman"/>
+          <w:sz w:val="28"/>
+          <w:szCs w:val="28"/>
+        </w:rPr>
+        <w:t xml:space="preserve"> </w:t>
+      </w:r>
+      <w:proofErr w:type="spellStart"/>
+      <w:r>
+        <w:rPr>
+          <w:rFonts w:ascii="Times New Roman" w:hAnsi="Times New Roman" w:cs="Times New Roman"/>
+          <w:sz w:val="28"/>
+          <w:szCs w:val="28"/>
+        </w:rPr>
+        <w:t>dintre</w:t>
+      </w:r>
+      <w:proofErr w:type="spellEnd"/>
+      <w:r>
+        <w:rPr>
+          <w:rFonts w:ascii="Times New Roman" w:hAnsi="Times New Roman" w:cs="Times New Roman"/>
+          <w:sz w:val="28"/>
+          <w:szCs w:val="28"/>
+        </w:rPr>
+        <w:t xml:space="preserve"> </w:t>
+      </w:r>
+      <w:proofErr w:type="spellStart"/>
+      <w:r>
+        <w:rPr>
+          <w:rFonts w:ascii="Times New Roman" w:hAnsi="Times New Roman" w:cs="Times New Roman"/>
+          <w:sz w:val="28"/>
+          <w:szCs w:val="28"/>
+        </w:rPr>
+        <w:t>vizitatorii</w:t>
+      </w:r>
+      <w:proofErr w:type="spellEnd"/>
+      <w:r>
+        <w:rPr>
+          <w:rFonts w:ascii="Times New Roman" w:hAnsi="Times New Roman" w:cs="Times New Roman"/>
+          <w:sz w:val="28"/>
+          <w:szCs w:val="28"/>
+        </w:rPr>
+        <w:t xml:space="preserve"> </w:t>
+      </w:r>
+      <w:proofErr w:type="spellStart"/>
+      <w:r>
+        <w:rPr>
+          <w:rFonts w:ascii="Times New Roman" w:hAnsi="Times New Roman" w:cs="Times New Roman"/>
+          <w:sz w:val="28"/>
+          <w:szCs w:val="28"/>
+        </w:rPr>
+        <w:t>interesați</w:t>
+      </w:r>
+      <w:proofErr w:type="spellEnd"/>
+      <w:r>
+        <w:rPr>
+          <w:rFonts w:ascii="Times New Roman" w:hAnsi="Times New Roman" w:cs="Times New Roman"/>
+          <w:sz w:val="28"/>
+          <w:szCs w:val="28"/>
+        </w:rPr>
+        <w:t xml:space="preserve"> de </w:t>
+      </w:r>
+      <w:proofErr w:type="spellStart"/>
+      <w:r>
+        <w:rPr>
+          <w:rFonts w:ascii="Times New Roman" w:hAnsi="Times New Roman" w:cs="Times New Roman"/>
+          <w:sz w:val="28"/>
+          <w:szCs w:val="28"/>
+        </w:rPr>
+        <w:t>achiziționarea</w:t>
+      </w:r>
+      <w:proofErr w:type="spellEnd"/>
+      <w:r>
+        <w:rPr>
+          <w:rFonts w:ascii="Times New Roman" w:hAnsi="Times New Roman" w:cs="Times New Roman"/>
+          <w:sz w:val="28"/>
+          <w:szCs w:val="28"/>
+        </w:rPr>
+        <w:t xml:space="preserve"> </w:t>
+      </w:r>
+      <w:proofErr w:type="spellStart"/>
+      <w:r>
+        <w:rPr>
+          <w:rFonts w:ascii="Times New Roman" w:hAnsi="Times New Roman" w:cs="Times New Roman"/>
+          <w:sz w:val="28"/>
+          <w:szCs w:val="28"/>
+        </w:rPr>
+        <w:t>unor</w:t>
+      </w:r>
+      <w:proofErr w:type="spellEnd"/>
+      <w:r>
+        <w:rPr>
+          <w:rFonts w:ascii="Times New Roman" w:hAnsi="Times New Roman" w:cs="Times New Roman"/>
+          <w:sz w:val="28"/>
+          <w:szCs w:val="28"/>
+        </w:rPr>
+        <w:t xml:space="preserve"> </w:t>
+      </w:r>
+      <w:proofErr w:type="spellStart"/>
+      <w:r>
+        <w:rPr>
+          <w:rFonts w:ascii="Times New Roman" w:hAnsi="Times New Roman" w:cs="Times New Roman"/>
+          <w:sz w:val="28"/>
+          <w:szCs w:val="28"/>
+        </w:rPr>
+        <w:t>autovehicule</w:t>
+      </w:r>
+      <w:proofErr w:type="spellEnd"/>
+      <w:r>
+        <w:rPr>
+          <w:rFonts w:ascii="Times New Roman" w:hAnsi="Times New Roman" w:cs="Times New Roman"/>
+          <w:sz w:val="28"/>
+          <w:szCs w:val="28"/>
+        </w:rPr>
+        <w:t xml:space="preserve"> </w:t>
+      </w:r>
+      <w:proofErr w:type="spellStart"/>
+      <w:r>
+        <w:rPr>
+          <w:rFonts w:ascii="Times New Roman" w:hAnsi="Times New Roman" w:cs="Times New Roman"/>
+          <w:sz w:val="28"/>
+          <w:szCs w:val="28"/>
+        </w:rPr>
+        <w:t>și</w:t>
+      </w:r>
+      <w:proofErr w:type="spellEnd"/>
+      <w:r>
+        <w:rPr>
+          <w:rFonts w:ascii="Times New Roman" w:hAnsi="Times New Roman" w:cs="Times New Roman"/>
+          <w:sz w:val="28"/>
+          <w:szCs w:val="28"/>
+        </w:rPr>
+        <w:t xml:space="preserve"> </w:t>
+      </w:r>
+      <w:proofErr w:type="spellStart"/>
+      <w:r>
+        <w:rPr>
+          <w:rFonts w:ascii="Times New Roman" w:hAnsi="Times New Roman" w:cs="Times New Roman"/>
+          <w:sz w:val="28"/>
+          <w:szCs w:val="28"/>
+        </w:rPr>
+        <w:t>clienții</w:t>
+      </w:r>
+      <w:proofErr w:type="spellEnd"/>
+      <w:r>
+        <w:rPr>
+          <w:rFonts w:ascii="Times New Roman" w:hAnsi="Times New Roman" w:cs="Times New Roman"/>
+          <w:sz w:val="28"/>
+          <w:szCs w:val="28"/>
+        </w:rPr>
+        <w:t xml:space="preserve"> care </w:t>
+      </w:r>
+      <w:proofErr w:type="spellStart"/>
+      <w:r>
+        <w:rPr>
+          <w:rFonts w:ascii="Times New Roman" w:hAnsi="Times New Roman" w:cs="Times New Roman"/>
+          <w:sz w:val="28"/>
+          <w:szCs w:val="28"/>
+        </w:rPr>
+        <w:t>doresc</w:t>
+      </w:r>
+      <w:proofErr w:type="spellEnd"/>
+      <w:r>
+        <w:rPr>
+          <w:rFonts w:ascii="Times New Roman" w:hAnsi="Times New Roman" w:cs="Times New Roman"/>
+          <w:sz w:val="28"/>
+          <w:szCs w:val="28"/>
+        </w:rPr>
+        <w:t xml:space="preserve"> </w:t>
+      </w:r>
+      <w:proofErr w:type="spellStart"/>
+      <w:r>
+        <w:rPr>
+          <w:rFonts w:ascii="Times New Roman" w:hAnsi="Times New Roman" w:cs="Times New Roman"/>
+          <w:sz w:val="28"/>
+          <w:szCs w:val="28"/>
+        </w:rPr>
+        <w:t>să</w:t>
+      </w:r>
+      <w:proofErr w:type="spellEnd"/>
+      <w:r>
+        <w:rPr>
+          <w:rFonts w:ascii="Times New Roman" w:hAnsi="Times New Roman" w:cs="Times New Roman"/>
+          <w:sz w:val="28"/>
+          <w:szCs w:val="28"/>
+        </w:rPr>
+        <w:t xml:space="preserve"> </w:t>
+      </w:r>
+      <w:proofErr w:type="spellStart"/>
+      <w:r>
+        <w:rPr>
+          <w:rFonts w:ascii="Times New Roman" w:hAnsi="Times New Roman" w:cs="Times New Roman"/>
+          <w:sz w:val="28"/>
+          <w:szCs w:val="28"/>
+        </w:rPr>
+        <w:t>își</w:t>
+      </w:r>
+      <w:proofErr w:type="spellEnd"/>
+      <w:r>
+        <w:rPr>
+          <w:rFonts w:ascii="Times New Roman" w:hAnsi="Times New Roman" w:cs="Times New Roman"/>
+          <w:sz w:val="28"/>
+          <w:szCs w:val="28"/>
+        </w:rPr>
+        <w:t xml:space="preserve"> </w:t>
+      </w:r>
+      <w:proofErr w:type="spellStart"/>
+      <w:r>
+        <w:rPr>
+          <w:rFonts w:ascii="Times New Roman" w:hAnsi="Times New Roman" w:cs="Times New Roman"/>
+          <w:sz w:val="28"/>
+          <w:szCs w:val="28"/>
+        </w:rPr>
+        <w:t>expună</w:t>
+      </w:r>
+      <w:proofErr w:type="spellEnd"/>
+      <w:r>
+        <w:rPr>
+          <w:rFonts w:ascii="Times New Roman" w:hAnsi="Times New Roman" w:cs="Times New Roman"/>
+          <w:sz w:val="28"/>
+          <w:szCs w:val="28"/>
+        </w:rPr>
+        <w:t xml:space="preserve"> </w:t>
+      </w:r>
+      <w:proofErr w:type="spellStart"/>
+      <w:r>
+        <w:rPr>
+          <w:rFonts w:ascii="Times New Roman" w:hAnsi="Times New Roman" w:cs="Times New Roman"/>
+          <w:sz w:val="28"/>
+          <w:szCs w:val="28"/>
+        </w:rPr>
+        <w:t>mașinile</w:t>
+      </w:r>
+      <w:proofErr w:type="spellEnd"/>
+      <w:r>
+        <w:rPr>
+          <w:rFonts w:ascii="Times New Roman" w:hAnsi="Times New Roman" w:cs="Times New Roman"/>
+          <w:sz w:val="28"/>
+          <w:szCs w:val="28"/>
+        </w:rPr>
+        <w:t xml:space="preserve"> </w:t>
+      </w:r>
+      <w:proofErr w:type="spellStart"/>
+      <w:r>
+        <w:rPr>
+          <w:rFonts w:ascii="Times New Roman" w:hAnsi="Times New Roman" w:cs="Times New Roman"/>
+          <w:sz w:val="28"/>
+          <w:szCs w:val="28"/>
+        </w:rPr>
+        <w:t>spre</w:t>
+      </w:r>
+      <w:proofErr w:type="spellEnd"/>
+      <w:r>
+        <w:rPr>
+          <w:rFonts w:ascii="Times New Roman" w:hAnsi="Times New Roman" w:cs="Times New Roman"/>
+          <w:sz w:val="28"/>
+          <w:szCs w:val="28"/>
+        </w:rPr>
+        <w:t xml:space="preserve"> </w:t>
+      </w:r>
+      <w:proofErr w:type="spellStart"/>
+      <w:r>
+        <w:rPr>
+          <w:rFonts w:ascii="Times New Roman" w:hAnsi="Times New Roman" w:cs="Times New Roman"/>
+          <w:sz w:val="28"/>
+          <w:szCs w:val="28"/>
+        </w:rPr>
+        <w:t>vânzare</w:t>
+      </w:r>
+      <w:proofErr w:type="spellEnd"/>
+      <w:r>
+        <w:rPr>
+          <w:rFonts w:ascii="Times New Roman" w:hAnsi="Times New Roman" w:cs="Times New Roman"/>
+          <w:sz w:val="28"/>
+          <w:szCs w:val="28"/>
+        </w:rPr>
+        <w:t xml:space="preserve">, </w:t>
+      </w:r>
+      <w:proofErr w:type="spellStart"/>
+      <w:r>
+        <w:rPr>
+          <w:rFonts w:ascii="Times New Roman" w:hAnsi="Times New Roman" w:cs="Times New Roman"/>
+          <w:sz w:val="28"/>
+          <w:szCs w:val="28"/>
+        </w:rPr>
+        <w:t>contracost</w:t>
+      </w:r>
+      <w:proofErr w:type="spellEnd"/>
+      <w:r>
+        <w:rPr>
+          <w:rFonts w:ascii="Times New Roman" w:hAnsi="Times New Roman" w:cs="Times New Roman"/>
+          <w:sz w:val="28"/>
+          <w:szCs w:val="28"/>
+        </w:rPr>
+        <w:t xml:space="preserve">, </w:t>
+      </w:r>
+      <w:proofErr w:type="spellStart"/>
+      <w:r>
+        <w:rPr>
+          <w:rFonts w:ascii="Times New Roman" w:hAnsi="Times New Roman" w:cs="Times New Roman"/>
+          <w:sz w:val="28"/>
+          <w:szCs w:val="28"/>
+        </w:rPr>
+        <w:t>în</w:t>
+      </w:r>
+      <w:proofErr w:type="spellEnd"/>
+      <w:r>
+        <w:rPr>
+          <w:rFonts w:ascii="Times New Roman" w:hAnsi="Times New Roman" w:cs="Times New Roman"/>
+          <w:sz w:val="28"/>
+          <w:szCs w:val="28"/>
+        </w:rPr>
+        <w:t xml:space="preserve"> </w:t>
+      </w:r>
+      <w:proofErr w:type="spellStart"/>
+      <w:r>
+        <w:rPr>
+          <w:rFonts w:ascii="Times New Roman" w:hAnsi="Times New Roman" w:cs="Times New Roman"/>
+          <w:sz w:val="28"/>
+          <w:szCs w:val="28"/>
+        </w:rPr>
+        <w:t>cadrul</w:t>
+      </w:r>
+      <w:proofErr w:type="spellEnd"/>
+      <w:r>
+        <w:rPr>
+          <w:rFonts w:ascii="Times New Roman" w:hAnsi="Times New Roman" w:cs="Times New Roman"/>
+          <w:sz w:val="28"/>
+          <w:szCs w:val="28"/>
+        </w:rPr>
+        <w:t xml:space="preserve"> </w:t>
+      </w:r>
+      <w:proofErr w:type="spellStart"/>
+      <w:r>
+        <w:rPr>
+          <w:rFonts w:ascii="Times New Roman" w:hAnsi="Times New Roman" w:cs="Times New Roman"/>
+          <w:sz w:val="28"/>
+          <w:szCs w:val="28"/>
+        </w:rPr>
+        <w:t>spațiului</w:t>
+      </w:r>
+      <w:proofErr w:type="spellEnd"/>
+      <w:r>
+        <w:rPr>
+          <w:rFonts w:ascii="Times New Roman" w:hAnsi="Times New Roman" w:cs="Times New Roman"/>
+          <w:sz w:val="28"/>
+          <w:szCs w:val="28"/>
+        </w:rPr>
+        <w:t xml:space="preserve"> </w:t>
+      </w:r>
+      <w:proofErr w:type="spellStart"/>
+      <w:r>
+        <w:rPr>
+          <w:rFonts w:ascii="Times New Roman" w:hAnsi="Times New Roman" w:cs="Times New Roman"/>
+          <w:sz w:val="28"/>
+          <w:szCs w:val="28"/>
+        </w:rPr>
+        <w:t>fizic</w:t>
+      </w:r>
+      <w:proofErr w:type="spellEnd"/>
+      <w:r>
+        <w:rPr>
+          <w:rFonts w:ascii="Times New Roman" w:hAnsi="Times New Roman" w:cs="Times New Roman"/>
+          <w:sz w:val="28"/>
+          <w:szCs w:val="28"/>
+        </w:rPr>
+        <w:t>.</w:t>
       </w:r>
     </w:p>
     <w:p>
@@ -780,7 +1718,205 @@
           <w:sz w:val="28"/>
           <w:szCs w:val="28"/>
         </w:rPr>
-        <w:t xml:space="preserve"> Platforma va oferi o evidență clară a disponibilității spațiului și a stării cererilor de listare.</w:t>
+        <w:t xml:space="preserve"> </w:t>
+      </w:r>
+      <w:proofErr w:type="spellStart"/>
+      <w:r>
+        <w:rPr>
+          <w:rFonts w:ascii="Times New Roman" w:hAnsi="Times New Roman" w:cs="Times New Roman"/>
+          <w:sz w:val="28"/>
+          <w:szCs w:val="28"/>
+        </w:rPr>
+        <w:t>Platforma</w:t>
+      </w:r>
+      <w:proofErr w:type="spellEnd"/>
+      <w:r>
+        <w:rPr>
+          <w:rFonts w:ascii="Times New Roman" w:hAnsi="Times New Roman" w:cs="Times New Roman"/>
+          <w:sz w:val="28"/>
+          <w:szCs w:val="28"/>
+        </w:rPr>
+        <w:t xml:space="preserve"> </w:t>
+      </w:r>
+      <w:proofErr w:type="spellStart"/>
+      <w:r>
+        <w:rPr>
+          <w:rFonts w:ascii="Times New Roman" w:hAnsi="Times New Roman" w:cs="Times New Roman"/>
+          <w:sz w:val="28"/>
+          <w:szCs w:val="28"/>
+        </w:rPr>
+        <w:t>va</w:t>
+      </w:r>
+      <w:proofErr w:type="spellEnd"/>
+      <w:r>
+        <w:rPr>
+          <w:rFonts w:ascii="Times New Roman" w:hAnsi="Times New Roman" w:cs="Times New Roman"/>
+          <w:sz w:val="28"/>
+          <w:szCs w:val="28"/>
+        </w:rPr>
+        <w:t xml:space="preserve"> </w:t>
+      </w:r>
+      <w:proofErr w:type="spellStart"/>
+      <w:r>
+        <w:rPr>
+          <w:rFonts w:ascii="Times New Roman" w:hAnsi="Times New Roman" w:cs="Times New Roman"/>
+          <w:sz w:val="28"/>
+          <w:szCs w:val="28"/>
+        </w:rPr>
+        <w:t>oferi</w:t>
+      </w:r>
+      <w:proofErr w:type="spellEnd"/>
+      <w:r>
+        <w:rPr>
+          <w:rFonts w:ascii="Times New Roman" w:hAnsi="Times New Roman" w:cs="Times New Roman"/>
+          <w:sz w:val="28"/>
+          <w:szCs w:val="28"/>
+        </w:rPr>
+        <w:t xml:space="preserve"> o </w:t>
+      </w:r>
+      <w:proofErr w:type="spellStart"/>
+      <w:r>
+        <w:rPr>
+          <w:rFonts w:ascii="Times New Roman" w:hAnsi="Times New Roman" w:cs="Times New Roman"/>
+          <w:sz w:val="28"/>
+          <w:szCs w:val="28"/>
+        </w:rPr>
+        <w:t>evidență</w:t>
+      </w:r>
+      <w:proofErr w:type="spellEnd"/>
+      <w:r>
+        <w:rPr>
+          <w:rFonts w:ascii="Times New Roman" w:hAnsi="Times New Roman" w:cs="Times New Roman"/>
+          <w:sz w:val="28"/>
+          <w:szCs w:val="28"/>
+        </w:rPr>
+        <w:t xml:space="preserve"> </w:t>
+      </w:r>
+      <w:proofErr w:type="spellStart"/>
+      <w:r>
+        <w:rPr>
+          <w:rFonts w:ascii="Times New Roman" w:hAnsi="Times New Roman" w:cs="Times New Roman"/>
+          <w:sz w:val="28"/>
+          <w:szCs w:val="28"/>
+        </w:rPr>
+        <w:t>clară</w:t>
+      </w:r>
+      <w:proofErr w:type="spellEnd"/>
+      <w:r>
+        <w:rPr>
+          <w:rFonts w:ascii="Times New Roman" w:hAnsi="Times New Roman" w:cs="Times New Roman"/>
+          <w:sz w:val="28"/>
+          <w:szCs w:val="28"/>
+        </w:rPr>
+        <w:t xml:space="preserve"> a </w:t>
+      </w:r>
+      <w:proofErr w:type="spellStart"/>
+      <w:r>
+        <w:rPr>
+          <w:rFonts w:ascii="Times New Roman" w:hAnsi="Times New Roman" w:cs="Times New Roman"/>
+          <w:sz w:val="28"/>
+          <w:szCs w:val="28"/>
+        </w:rPr>
+        <w:t>disponibilității</w:t>
+      </w:r>
+      <w:proofErr w:type="spellEnd"/>
+      <w:r>
+        <w:rPr>
+          <w:rFonts w:ascii="Times New Roman" w:hAnsi="Times New Roman" w:cs="Times New Roman"/>
+          <w:sz w:val="28"/>
+          <w:szCs w:val="28"/>
+        </w:rPr>
+        <w:t xml:space="preserve"> </w:t>
+      </w:r>
+      <w:proofErr w:type="spellStart"/>
+      <w:r>
+        <w:rPr>
+          <w:rFonts w:ascii="Times New Roman" w:hAnsi="Times New Roman" w:cs="Times New Roman"/>
+          <w:sz w:val="28"/>
+          <w:szCs w:val="28"/>
+        </w:rPr>
+        <w:t>spațiului</w:t>
+      </w:r>
+      <w:proofErr w:type="spellEnd"/>
+      <w:r>
+        <w:rPr>
+          <w:rFonts w:ascii="Times New Roman" w:hAnsi="Times New Roman" w:cs="Times New Roman"/>
+          <w:sz w:val="28"/>
+          <w:szCs w:val="28"/>
+        </w:rPr>
+        <w:t xml:space="preserve"> </w:t>
+      </w:r>
+      <w:proofErr w:type="spellStart"/>
+      <w:r>
+        <w:rPr>
+          <w:rFonts w:ascii="Times New Roman" w:hAnsi="Times New Roman" w:cs="Times New Roman"/>
+          <w:sz w:val="28"/>
+          <w:szCs w:val="28"/>
+        </w:rPr>
+        <w:t>și</w:t>
+      </w:r>
+      <w:proofErr w:type="spellEnd"/>
+      <w:r>
+        <w:rPr>
+          <w:rFonts w:ascii="Times New Roman" w:hAnsi="Times New Roman" w:cs="Times New Roman"/>
+          <w:sz w:val="28"/>
+          <w:szCs w:val="28"/>
+        </w:rPr>
+        <w:t xml:space="preserve"> a </w:t>
+      </w:r>
+      <w:proofErr w:type="spellStart"/>
+      <w:r>
+        <w:rPr>
+          <w:rFonts w:ascii="Times New Roman" w:hAnsi="Times New Roman" w:cs="Times New Roman"/>
+          <w:sz w:val="28"/>
+          <w:szCs w:val="28"/>
+        </w:rPr>
+        <w:t>stării</w:t>
+      </w:r>
+      <w:proofErr w:type="spellEnd"/>
+      <w:r>
+        <w:rPr>
+          <w:rFonts w:ascii="Times New Roman" w:hAnsi="Times New Roman" w:cs="Times New Roman"/>
+          <w:sz w:val="28"/>
+          <w:szCs w:val="28"/>
+        </w:rPr>
+        <w:t xml:space="preserve"> </w:t>
+      </w:r>
+      <w:proofErr w:type="spellStart"/>
+      <w:r>
+        <w:rPr>
+          <w:rFonts w:ascii="Times New Roman" w:hAnsi="Times New Roman" w:cs="Times New Roman"/>
+          <w:sz w:val="28"/>
+          <w:szCs w:val="28"/>
+        </w:rPr>
+        <w:t>cererilor</w:t>
+      </w:r>
+      <w:proofErr w:type="spellEnd"/>
+      <w:r>
+        <w:rPr>
+          <w:rFonts w:ascii="Times New Roman" w:hAnsi="Times New Roman" w:cs="Times New Roman"/>
+          <w:sz w:val="28"/>
+          <w:szCs w:val="28"/>
+        </w:rPr>
+        <w:t xml:space="preserve"> de </w:t>
+      </w:r>
+      <w:proofErr w:type="spellStart"/>
+      <w:r>
+        <w:rPr>
+          <w:rFonts w:ascii="Times New Roman" w:hAnsi="Times New Roman" w:cs="Times New Roman"/>
+          <w:sz w:val="28"/>
+          <w:szCs w:val="28"/>
+        </w:rPr>
+        <w:t>listare</w:t>
+      </w:r>
+      <w:proofErr w:type="spellEnd"/>
+      <w:r>
+        <w:rPr>
+          <w:rFonts w:ascii="Times New Roman" w:hAnsi="Times New Roman" w:cs="Times New Roman"/>
+          <w:sz w:val="28"/>
+          <w:szCs w:val="28"/>
+        </w:rPr>
+        <w:t>.</w:t>
       </w:r>
     </w:p>
     <w:p>
@@ -971,15 +2107,6 @@
     </w:p>
     <w:p>
       <w:pPr>
-        <w:rPr>
-          <w:rFonts w:ascii="Times New Roman" w:hAnsi="Times New Roman" w:cs="Times New Roman"/>
-          <w:sz w:val="36"/>
-          <w:szCs w:val="36"/>
-        </w:rPr>
-      </w:pPr>
-    </w:p>
-    <w:p>
-      <w:pPr>
         <w:pStyle w:val="Heading1"/>
         <w:jc w:val="center"/>
         <w:rPr>
@@ -996,6 +2123,7 @@
           <w:sz w:val="44"/>
           <w:szCs w:val="44"/>
         </w:rPr>
+        <w:lastRenderedPageBreak/>
         <w:t>Analiza Cerin</w:t>
       </w:r>
       <w:r>
@@ -1033,139 +2161,2498 @@
         <w:rPr>
           <w:rFonts w:ascii="Times New Roman" w:hAnsi="Times New Roman" w:cs="Times New Roman"/>
         </w:rPr>
-        <w:t>Aplicația va fi structurată pe o arhitectură client-server, utilizând o interfață ReactJS și un sistem de gestiune a bazelor de date MySQL. Din perspectiva regulilor de business, platforma impune următoarele constrângeri logice:</w:t>
-      </w:r>
-    </w:p>
-    <w:p>
-      <w:pPr>
-        <w:rPr>
-          <w:rFonts w:ascii="Times New Roman" w:hAnsi="Times New Roman" w:cs="Times New Roman"/>
-        </w:rPr>
-      </w:pPr>
-    </w:p>
-    <w:p>
-      <w:pPr>
-        <w:pStyle w:val="ListParagraph"/>
-        <w:numPr>
-          <w:ilvl w:val="0"/>
-          <w:numId w:val="3"/>
-        </w:numPr>
-        <w:rPr>
-          <w:rFonts w:ascii="Times New Roman" w:hAnsi="Times New Roman" w:cs="Times New Roman"/>
-        </w:rPr>
-      </w:pPr>
-      <w:r>
-        <w:rPr>
-          <w:rFonts w:ascii="Times New Roman" w:hAnsi="Times New Roman" w:cs="Times New Roman"/>
-        </w:rPr>
-        <w:t>Gestiunea Spațiului: Târgul este limitat la 40 de locuri de parcare distincte. O mașină poate fi alocată unui singur loc fizic la un moment dat, iar un loc de parcare nu poate găzdui mai mult de un autovehicul simultan.</w:t>
-      </w:r>
-    </w:p>
-    <w:p>
-      <w:pPr>
-        <w:rPr>
-          <w:rFonts w:ascii="Times New Roman" w:hAnsi="Times New Roman" w:cs="Times New Roman"/>
-        </w:rPr>
-      </w:pPr>
-    </w:p>
-    <w:p>
-      <w:pPr>
-        <w:pStyle w:val="ListParagraph"/>
-        <w:numPr>
-          <w:ilvl w:val="0"/>
-          <w:numId w:val="3"/>
-        </w:numPr>
-        <w:rPr>
-          <w:rFonts w:ascii="Times New Roman" w:hAnsi="Times New Roman" w:cs="Times New Roman"/>
-        </w:rPr>
-      </w:pPr>
-      <w:r>
-        <w:rPr>
-          <w:rFonts w:ascii="Times New Roman" w:hAnsi="Times New Roman" w:cs="Times New Roman"/>
-        </w:rPr>
-        <w:t>Unificarea Conturilor: Nu există o segregare între cumpărători și vânzători. Orice vizitator care își creează un cont devine "Client". Acesta are posibilitatea să interacționeze cu anunțurile existente sau să depună o cerere pentru a-și expune propria mașină.</w:t>
-      </w:r>
-    </w:p>
-    <w:p>
-      <w:pPr>
-        <w:rPr>
-          <w:rFonts w:ascii="Times New Roman" w:hAnsi="Times New Roman" w:cs="Times New Roman"/>
-        </w:rPr>
-      </w:pPr>
-    </w:p>
-    <w:p>
-      <w:pPr>
-        <w:pStyle w:val="ListParagraph"/>
-        <w:numPr>
-          <w:ilvl w:val="0"/>
-          <w:numId w:val="3"/>
-        </w:numPr>
-        <w:rPr>
-          <w:rFonts w:ascii="Times New Roman" w:hAnsi="Times New Roman" w:cs="Times New Roman"/>
-        </w:rPr>
-      </w:pPr>
-      <w:r>
-        <w:rPr>
-          <w:rFonts w:ascii="Times New Roman" w:hAnsi="Times New Roman" w:cs="Times New Roman"/>
-        </w:rPr>
-        <w:t>Fluxul de Publicare: Listarea unui vehicul nu se face instantaneu. Clientul inițiază o cerere care conține datele autoturismului. Administratorul revizuiește cererea, percepe taxa de ocupare a locului și, în caz de aprobare, asociază mașina cu un loc de parcare liber din sistem, moment în care vehiculul devine vizibil pe platformă.</w:t>
-      </w:r>
-    </w:p>
-    <w:p>
-      <w:pPr>
-        <w:rPr>
-          <w:rFonts w:ascii="Times New Roman" w:hAnsi="Times New Roman" w:cs="Times New Roman"/>
-        </w:rPr>
-      </w:pPr>
-    </w:p>
-    <w:p>
-      <w:pPr>
-        <w:pStyle w:val="ListParagraph"/>
-        <w:numPr>
-          <w:ilvl w:val="0"/>
-          <w:numId w:val="3"/>
-        </w:numPr>
-        <w:rPr>
-          <w:rFonts w:ascii="Times New Roman" w:hAnsi="Times New Roman" w:cs="Times New Roman"/>
-        </w:rPr>
-      </w:pPr>
-      <w:r>
-        <w:rPr>
-          <w:rFonts w:ascii="Times New Roman" w:hAnsi="Times New Roman" w:cs="Times New Roman"/>
-        </w:rPr>
-        <w:t>Detalierea Vehiculelor: Sistemul trebuie să stocheze eficient detaliate despre mașini, impunând extragerea nomenclatoarelor în tabele separate</w:t>
-      </w:r>
+        <w:t xml:space="preserve">UTILIZATOR: </w:t>
+      </w:r>
+      <w:proofErr w:type="spellStart"/>
+      <w:r>
+        <w:rPr>
+          <w:rFonts w:ascii="Times New Roman" w:hAnsi="Times New Roman" w:cs="Times New Roman"/>
+        </w:rPr>
+        <w:t>Reprezintă</w:t>
+      </w:r>
+      <w:proofErr w:type="spellEnd"/>
+      <w:r>
+        <w:rPr>
+          <w:rFonts w:ascii="Times New Roman" w:hAnsi="Times New Roman" w:cs="Times New Roman"/>
+        </w:rPr>
+        <w:t xml:space="preserve"> </w:t>
+      </w:r>
+      <w:proofErr w:type="spellStart"/>
+      <w:r>
+        <w:rPr>
+          <w:rFonts w:ascii="Times New Roman" w:hAnsi="Times New Roman" w:cs="Times New Roman"/>
+        </w:rPr>
+        <w:t>orice</w:t>
+      </w:r>
+      <w:proofErr w:type="spellEnd"/>
+      <w:r>
+        <w:rPr>
+          <w:rFonts w:ascii="Times New Roman" w:hAnsi="Times New Roman" w:cs="Times New Roman"/>
+        </w:rPr>
+        <w:t xml:space="preserve"> actor </w:t>
+      </w:r>
+      <w:proofErr w:type="spellStart"/>
+      <w:r>
+        <w:rPr>
+          <w:rFonts w:ascii="Times New Roman" w:hAnsi="Times New Roman" w:cs="Times New Roman"/>
+        </w:rPr>
+        <w:t>uman</w:t>
+      </w:r>
+      <w:proofErr w:type="spellEnd"/>
+      <w:r>
+        <w:rPr>
+          <w:rFonts w:ascii="Times New Roman" w:hAnsi="Times New Roman" w:cs="Times New Roman"/>
+        </w:rPr>
+        <w:t xml:space="preserve"> care </w:t>
+      </w:r>
+      <w:proofErr w:type="spellStart"/>
+      <w:r>
+        <w:rPr>
+          <w:rFonts w:ascii="Times New Roman" w:hAnsi="Times New Roman" w:cs="Times New Roman"/>
+        </w:rPr>
+        <w:t>interacționează</w:t>
+      </w:r>
+      <w:proofErr w:type="spellEnd"/>
+      <w:r>
+        <w:rPr>
+          <w:rFonts w:ascii="Times New Roman" w:hAnsi="Times New Roman" w:cs="Times New Roman"/>
+        </w:rPr>
+        <w:t xml:space="preserve"> cu </w:t>
+      </w:r>
+      <w:proofErr w:type="spellStart"/>
+      <w:r>
+        <w:rPr>
+          <w:rFonts w:ascii="Times New Roman" w:hAnsi="Times New Roman" w:cs="Times New Roman"/>
+        </w:rPr>
+        <w:t>platforma</w:t>
+      </w:r>
+      <w:proofErr w:type="spellEnd"/>
+      <w:r>
+        <w:rPr>
+          <w:rFonts w:ascii="Times New Roman" w:hAnsi="Times New Roman" w:cs="Times New Roman"/>
+        </w:rPr>
+        <w:t xml:space="preserve"> (fie </w:t>
+      </w:r>
+      <w:proofErr w:type="spellStart"/>
+      <w:r>
+        <w:rPr>
+          <w:rFonts w:ascii="Times New Roman" w:hAnsi="Times New Roman" w:cs="Times New Roman"/>
+        </w:rPr>
+        <w:t>că</w:t>
+      </w:r>
+      <w:proofErr w:type="spellEnd"/>
+      <w:r>
+        <w:rPr>
+          <w:rFonts w:ascii="Times New Roman" w:hAnsi="Times New Roman" w:cs="Times New Roman"/>
+        </w:rPr>
+        <w:t xml:space="preserve"> </w:t>
+      </w:r>
+      <w:proofErr w:type="spellStart"/>
+      <w:r>
+        <w:rPr>
+          <w:rFonts w:ascii="Times New Roman" w:hAnsi="Times New Roman" w:cs="Times New Roman"/>
+        </w:rPr>
+        <w:t>este</w:t>
+      </w:r>
+      <w:proofErr w:type="spellEnd"/>
+      <w:r>
+        <w:rPr>
+          <w:rFonts w:ascii="Times New Roman" w:hAnsi="Times New Roman" w:cs="Times New Roman"/>
+        </w:rPr>
+        <w:t xml:space="preserve"> </w:t>
+      </w:r>
+      <w:proofErr w:type="spellStart"/>
+      <w:r>
+        <w:rPr>
+          <w:rFonts w:ascii="Times New Roman" w:hAnsi="Times New Roman" w:cs="Times New Roman"/>
+        </w:rPr>
+        <w:t>administratorul</w:t>
+      </w:r>
+      <w:proofErr w:type="spellEnd"/>
+      <w:r>
+        <w:rPr>
+          <w:rFonts w:ascii="Times New Roman" w:hAnsi="Times New Roman" w:cs="Times New Roman"/>
+        </w:rPr>
+        <w:t xml:space="preserve"> </w:t>
+      </w:r>
+      <w:proofErr w:type="spellStart"/>
+      <w:r>
+        <w:rPr>
+          <w:rFonts w:ascii="Times New Roman" w:hAnsi="Times New Roman" w:cs="Times New Roman"/>
+        </w:rPr>
+        <w:t>târgului</w:t>
+      </w:r>
+      <w:proofErr w:type="spellEnd"/>
+      <w:r>
+        <w:rPr>
+          <w:rFonts w:ascii="Times New Roman" w:hAnsi="Times New Roman" w:cs="Times New Roman"/>
+        </w:rPr>
+        <w:t xml:space="preserve"> </w:t>
+      </w:r>
+      <w:proofErr w:type="spellStart"/>
+      <w:r>
+        <w:rPr>
+          <w:rFonts w:ascii="Times New Roman" w:hAnsi="Times New Roman" w:cs="Times New Roman"/>
+        </w:rPr>
+        <w:t>sau</w:t>
+      </w:r>
+      <w:proofErr w:type="spellEnd"/>
+      <w:r>
+        <w:rPr>
+          <w:rFonts w:ascii="Times New Roman" w:hAnsi="Times New Roman" w:cs="Times New Roman"/>
+        </w:rPr>
+        <w:t xml:space="preserve"> un client care </w:t>
+      </w:r>
+      <w:proofErr w:type="spellStart"/>
+      <w:r>
+        <w:rPr>
+          <w:rFonts w:ascii="Times New Roman" w:hAnsi="Times New Roman" w:cs="Times New Roman"/>
+        </w:rPr>
+        <w:t>vinde</w:t>
+      </w:r>
+      <w:proofErr w:type="spellEnd"/>
+      <w:r>
+        <w:rPr>
+          <w:rFonts w:ascii="Times New Roman" w:hAnsi="Times New Roman" w:cs="Times New Roman"/>
+        </w:rPr>
+        <w:t>/</w:t>
+      </w:r>
+      <w:proofErr w:type="spellStart"/>
+      <w:r>
+        <w:rPr>
+          <w:rFonts w:ascii="Times New Roman" w:hAnsi="Times New Roman" w:cs="Times New Roman"/>
+        </w:rPr>
+        <w:t>cumpără</w:t>
+      </w:r>
+      <w:proofErr w:type="spellEnd"/>
+      <w:r>
+        <w:rPr>
+          <w:rFonts w:ascii="Times New Roman" w:hAnsi="Times New Roman" w:cs="Times New Roman"/>
+        </w:rPr>
+        <w:t>).</w:t>
+      </w:r>
+    </w:p>
+    <w:p>
+      <w:pPr>
+        <w:rPr>
+          <w:rFonts w:ascii="Times New Roman" w:hAnsi="Times New Roman" w:cs="Times New Roman"/>
+        </w:rPr>
+      </w:pPr>
+      <w:r>
+        <w:rPr>
+          <w:rFonts w:ascii="Times New Roman" w:hAnsi="Times New Roman" w:cs="Times New Roman"/>
+        </w:rPr>
+        <w:t xml:space="preserve">MASINA: Este </w:t>
+      </w:r>
+      <w:proofErr w:type="spellStart"/>
+      <w:r>
+        <w:rPr>
+          <w:rFonts w:ascii="Times New Roman" w:hAnsi="Times New Roman" w:cs="Times New Roman"/>
+        </w:rPr>
+        <w:t>entitatea</w:t>
+      </w:r>
+      <w:proofErr w:type="spellEnd"/>
+      <w:r>
+        <w:rPr>
+          <w:rFonts w:ascii="Times New Roman" w:hAnsi="Times New Roman" w:cs="Times New Roman"/>
+        </w:rPr>
+        <w:t xml:space="preserve"> </w:t>
+      </w:r>
+      <w:proofErr w:type="spellStart"/>
+      <w:r>
+        <w:rPr>
+          <w:rFonts w:ascii="Times New Roman" w:hAnsi="Times New Roman" w:cs="Times New Roman"/>
+        </w:rPr>
+        <w:t>centrală</w:t>
+      </w:r>
+      <w:proofErr w:type="spellEnd"/>
+      <w:r>
+        <w:rPr>
+          <w:rFonts w:ascii="Times New Roman" w:hAnsi="Times New Roman" w:cs="Times New Roman"/>
+        </w:rPr>
+        <w:t xml:space="preserve"> </w:t>
+      </w:r>
+      <w:proofErr w:type="gramStart"/>
+      <w:r>
+        <w:rPr>
+          <w:rFonts w:ascii="Times New Roman" w:hAnsi="Times New Roman" w:cs="Times New Roman"/>
+        </w:rPr>
+        <w:t>a</w:t>
+      </w:r>
+      <w:proofErr w:type="gramEnd"/>
+      <w:r>
+        <w:rPr>
+          <w:rFonts w:ascii="Times New Roman" w:hAnsi="Times New Roman" w:cs="Times New Roman"/>
+        </w:rPr>
+        <w:t xml:space="preserve"> </w:t>
+      </w:r>
+      <w:proofErr w:type="spellStart"/>
+      <w:r>
+        <w:rPr>
+          <w:rFonts w:ascii="Times New Roman" w:hAnsi="Times New Roman" w:cs="Times New Roman"/>
+        </w:rPr>
+        <w:t>aplicației</w:t>
+      </w:r>
+      <w:proofErr w:type="spellEnd"/>
+      <w:r>
+        <w:rPr>
+          <w:rFonts w:ascii="Times New Roman" w:hAnsi="Times New Roman" w:cs="Times New Roman"/>
+        </w:rPr>
+        <w:t xml:space="preserve">, </w:t>
+      </w:r>
+      <w:proofErr w:type="spellStart"/>
+      <w:r>
+        <w:rPr>
+          <w:rFonts w:ascii="Times New Roman" w:hAnsi="Times New Roman" w:cs="Times New Roman"/>
+        </w:rPr>
+        <w:t>reprezentând</w:t>
+      </w:r>
+      <w:proofErr w:type="spellEnd"/>
+      <w:r>
+        <w:rPr>
+          <w:rFonts w:ascii="Times New Roman" w:hAnsi="Times New Roman" w:cs="Times New Roman"/>
+        </w:rPr>
+        <w:t xml:space="preserve"> </w:t>
+      </w:r>
+      <w:proofErr w:type="spellStart"/>
+      <w:r>
+        <w:rPr>
+          <w:rFonts w:ascii="Times New Roman" w:hAnsi="Times New Roman" w:cs="Times New Roman"/>
+        </w:rPr>
+        <w:t>autovehiculul</w:t>
+      </w:r>
+      <w:proofErr w:type="spellEnd"/>
+      <w:r>
+        <w:rPr>
+          <w:rFonts w:ascii="Times New Roman" w:hAnsi="Times New Roman" w:cs="Times New Roman"/>
+        </w:rPr>
+        <w:t xml:space="preserve"> </w:t>
+      </w:r>
+      <w:proofErr w:type="spellStart"/>
+      <w:r>
+        <w:rPr>
+          <w:rFonts w:ascii="Times New Roman" w:hAnsi="Times New Roman" w:cs="Times New Roman"/>
+        </w:rPr>
+        <w:t>fizic</w:t>
+      </w:r>
+      <w:proofErr w:type="spellEnd"/>
+      <w:r>
+        <w:rPr>
+          <w:rFonts w:ascii="Times New Roman" w:hAnsi="Times New Roman" w:cs="Times New Roman"/>
+        </w:rPr>
+        <w:t xml:space="preserve"> </w:t>
+      </w:r>
+      <w:proofErr w:type="spellStart"/>
+      <w:r>
+        <w:rPr>
+          <w:rFonts w:ascii="Times New Roman" w:hAnsi="Times New Roman" w:cs="Times New Roman"/>
+        </w:rPr>
+        <w:t>adus</w:t>
+      </w:r>
+      <w:proofErr w:type="spellEnd"/>
+      <w:r>
+        <w:rPr>
+          <w:rFonts w:ascii="Times New Roman" w:hAnsi="Times New Roman" w:cs="Times New Roman"/>
+        </w:rPr>
+        <w:t xml:space="preserve"> </w:t>
+      </w:r>
+      <w:proofErr w:type="spellStart"/>
+      <w:r>
+        <w:rPr>
+          <w:rFonts w:ascii="Times New Roman" w:hAnsi="Times New Roman" w:cs="Times New Roman"/>
+        </w:rPr>
+        <w:t>spre</w:t>
+      </w:r>
+      <w:proofErr w:type="spellEnd"/>
+      <w:r>
+        <w:rPr>
+          <w:rFonts w:ascii="Times New Roman" w:hAnsi="Times New Roman" w:cs="Times New Roman"/>
+        </w:rPr>
+        <w:t xml:space="preserve"> </w:t>
+      </w:r>
+      <w:proofErr w:type="spellStart"/>
+      <w:r>
+        <w:rPr>
+          <w:rFonts w:ascii="Times New Roman" w:hAnsi="Times New Roman" w:cs="Times New Roman"/>
+        </w:rPr>
+        <w:t>expunere</w:t>
+      </w:r>
+      <w:proofErr w:type="spellEnd"/>
+      <w:r>
+        <w:rPr>
+          <w:rFonts w:ascii="Times New Roman" w:hAnsi="Times New Roman" w:cs="Times New Roman"/>
+        </w:rPr>
+        <w:t xml:space="preserve"> </w:t>
+      </w:r>
+      <w:proofErr w:type="spellStart"/>
+      <w:r>
+        <w:rPr>
+          <w:rFonts w:ascii="Times New Roman" w:hAnsi="Times New Roman" w:cs="Times New Roman"/>
+        </w:rPr>
+        <w:t>și</w:t>
+      </w:r>
+      <w:proofErr w:type="spellEnd"/>
+      <w:r>
+        <w:rPr>
+          <w:rFonts w:ascii="Times New Roman" w:hAnsi="Times New Roman" w:cs="Times New Roman"/>
+        </w:rPr>
+        <w:t xml:space="preserve"> </w:t>
+      </w:r>
+      <w:proofErr w:type="spellStart"/>
+      <w:r>
+        <w:rPr>
+          <w:rFonts w:ascii="Times New Roman" w:hAnsi="Times New Roman" w:cs="Times New Roman"/>
+        </w:rPr>
+        <w:t>vânzare</w:t>
+      </w:r>
+      <w:proofErr w:type="spellEnd"/>
+      <w:r>
+        <w:rPr>
+          <w:rFonts w:ascii="Times New Roman" w:hAnsi="Times New Roman" w:cs="Times New Roman"/>
+        </w:rPr>
+        <w:t>.</w:t>
+      </w:r>
+    </w:p>
+    <w:p>
+      <w:pPr>
+        <w:rPr>
+          <w:rFonts w:ascii="Times New Roman" w:hAnsi="Times New Roman" w:cs="Times New Roman"/>
+        </w:rPr>
+      </w:pPr>
+      <w:r>
+        <w:rPr>
+          <w:rFonts w:ascii="Times New Roman" w:hAnsi="Times New Roman" w:cs="Times New Roman"/>
+        </w:rPr>
+        <w:t xml:space="preserve">LOC_PARCARE: </w:t>
+      </w:r>
+      <w:proofErr w:type="spellStart"/>
+      <w:r>
+        <w:rPr>
+          <w:rFonts w:ascii="Times New Roman" w:hAnsi="Times New Roman" w:cs="Times New Roman"/>
+        </w:rPr>
+        <w:t>Reprezintă</w:t>
+      </w:r>
+      <w:proofErr w:type="spellEnd"/>
+      <w:r>
+        <w:rPr>
+          <w:rFonts w:ascii="Times New Roman" w:hAnsi="Times New Roman" w:cs="Times New Roman"/>
+        </w:rPr>
+        <w:t xml:space="preserve"> o </w:t>
+      </w:r>
+      <w:proofErr w:type="spellStart"/>
+      <w:r>
+        <w:rPr>
+          <w:rFonts w:ascii="Times New Roman" w:hAnsi="Times New Roman" w:cs="Times New Roman"/>
+        </w:rPr>
+        <w:t>resursă</w:t>
+      </w:r>
+      <w:proofErr w:type="spellEnd"/>
+      <w:r>
+        <w:rPr>
+          <w:rFonts w:ascii="Times New Roman" w:hAnsi="Times New Roman" w:cs="Times New Roman"/>
+        </w:rPr>
+        <w:t xml:space="preserve"> </w:t>
+      </w:r>
+      <w:proofErr w:type="spellStart"/>
+      <w:r>
+        <w:rPr>
+          <w:rFonts w:ascii="Times New Roman" w:hAnsi="Times New Roman" w:cs="Times New Roman"/>
+        </w:rPr>
+        <w:t>fizică</w:t>
+      </w:r>
+      <w:proofErr w:type="spellEnd"/>
+      <w:r>
+        <w:rPr>
+          <w:rFonts w:ascii="Times New Roman" w:hAnsi="Times New Roman" w:cs="Times New Roman"/>
+        </w:rPr>
+        <w:t xml:space="preserve"> </w:t>
+      </w:r>
+      <w:proofErr w:type="spellStart"/>
+      <w:r>
+        <w:rPr>
+          <w:rFonts w:ascii="Times New Roman" w:hAnsi="Times New Roman" w:cs="Times New Roman"/>
+        </w:rPr>
+        <w:t>spațială</w:t>
+      </w:r>
+      <w:proofErr w:type="spellEnd"/>
+      <w:r>
+        <w:rPr>
+          <w:rFonts w:ascii="Times New Roman" w:hAnsi="Times New Roman" w:cs="Times New Roman"/>
+        </w:rPr>
+        <w:t xml:space="preserve"> </w:t>
+      </w:r>
+      <w:proofErr w:type="spellStart"/>
+      <w:r>
+        <w:rPr>
+          <w:rFonts w:ascii="Times New Roman" w:hAnsi="Times New Roman" w:cs="Times New Roman"/>
+        </w:rPr>
+        <w:t>limitată</w:t>
+      </w:r>
+      <w:proofErr w:type="spellEnd"/>
+      <w:r>
+        <w:rPr>
+          <w:rFonts w:ascii="Times New Roman" w:hAnsi="Times New Roman" w:cs="Times New Roman"/>
+        </w:rPr>
+        <w:t xml:space="preserve"> (</w:t>
+      </w:r>
+      <w:proofErr w:type="spellStart"/>
+      <w:r>
+        <w:rPr>
+          <w:rFonts w:ascii="Times New Roman" w:hAnsi="Times New Roman" w:cs="Times New Roman"/>
+        </w:rPr>
+        <w:t>una</w:t>
+      </w:r>
+      <w:proofErr w:type="spellEnd"/>
+      <w:r>
+        <w:rPr>
+          <w:rFonts w:ascii="Times New Roman" w:hAnsi="Times New Roman" w:cs="Times New Roman"/>
+        </w:rPr>
+        <w:t xml:space="preserve"> </w:t>
+      </w:r>
+      <w:proofErr w:type="spellStart"/>
+      <w:r>
+        <w:rPr>
+          <w:rFonts w:ascii="Times New Roman" w:hAnsi="Times New Roman" w:cs="Times New Roman"/>
+        </w:rPr>
+        <w:t>dintre</w:t>
+      </w:r>
+      <w:proofErr w:type="spellEnd"/>
+      <w:r>
+        <w:rPr>
+          <w:rFonts w:ascii="Times New Roman" w:hAnsi="Times New Roman" w:cs="Times New Roman"/>
+        </w:rPr>
+        <w:t xml:space="preserve"> </w:t>
+      </w:r>
+      <w:proofErr w:type="spellStart"/>
+      <w:r>
+        <w:rPr>
+          <w:rFonts w:ascii="Times New Roman" w:hAnsi="Times New Roman" w:cs="Times New Roman"/>
+        </w:rPr>
+        <w:t>cele</w:t>
+      </w:r>
+      <w:proofErr w:type="spellEnd"/>
+      <w:r>
+        <w:rPr>
+          <w:rFonts w:ascii="Times New Roman" w:hAnsi="Times New Roman" w:cs="Times New Roman"/>
+        </w:rPr>
+        <w:t xml:space="preserve"> 40 de </w:t>
+      </w:r>
+      <w:proofErr w:type="spellStart"/>
+      <w:r>
+        <w:rPr>
+          <w:rFonts w:ascii="Times New Roman" w:hAnsi="Times New Roman" w:cs="Times New Roman"/>
+        </w:rPr>
+        <w:t>parcele</w:t>
+      </w:r>
+      <w:proofErr w:type="spellEnd"/>
+      <w:r>
+        <w:rPr>
+          <w:rFonts w:ascii="Times New Roman" w:hAnsi="Times New Roman" w:cs="Times New Roman"/>
+        </w:rPr>
+        <w:t xml:space="preserve"> din </w:t>
+      </w:r>
+      <w:proofErr w:type="spellStart"/>
+      <w:r>
+        <w:rPr>
+          <w:rFonts w:ascii="Times New Roman" w:hAnsi="Times New Roman" w:cs="Times New Roman"/>
+        </w:rPr>
+        <w:t>târg</w:t>
+      </w:r>
+      <w:proofErr w:type="spellEnd"/>
+      <w:r>
+        <w:rPr>
+          <w:rFonts w:ascii="Times New Roman" w:hAnsi="Times New Roman" w:cs="Times New Roman"/>
+        </w:rPr>
+        <w:t xml:space="preserve">) care </w:t>
+      </w:r>
+      <w:proofErr w:type="spellStart"/>
+      <w:r>
+        <w:rPr>
+          <w:rFonts w:ascii="Times New Roman" w:hAnsi="Times New Roman" w:cs="Times New Roman"/>
+        </w:rPr>
+        <w:t>poate</w:t>
+      </w:r>
+      <w:proofErr w:type="spellEnd"/>
+      <w:r>
+        <w:rPr>
+          <w:rFonts w:ascii="Times New Roman" w:hAnsi="Times New Roman" w:cs="Times New Roman"/>
+        </w:rPr>
+        <w:t xml:space="preserve"> fi </w:t>
+      </w:r>
+      <w:proofErr w:type="spellStart"/>
+      <w:r>
+        <w:rPr>
+          <w:rFonts w:ascii="Times New Roman" w:hAnsi="Times New Roman" w:cs="Times New Roman"/>
+        </w:rPr>
+        <w:t>alocată</w:t>
+      </w:r>
+      <w:proofErr w:type="spellEnd"/>
+      <w:r>
+        <w:rPr>
+          <w:rFonts w:ascii="Times New Roman" w:hAnsi="Times New Roman" w:cs="Times New Roman"/>
+        </w:rPr>
+        <w:t xml:space="preserve"> </w:t>
+      </w:r>
+      <w:proofErr w:type="spellStart"/>
+      <w:r>
+        <w:rPr>
+          <w:rFonts w:ascii="Times New Roman" w:hAnsi="Times New Roman" w:cs="Times New Roman"/>
+        </w:rPr>
+        <w:t>unui</w:t>
+      </w:r>
+      <w:proofErr w:type="spellEnd"/>
+      <w:r>
+        <w:rPr>
+          <w:rFonts w:ascii="Times New Roman" w:hAnsi="Times New Roman" w:cs="Times New Roman"/>
+        </w:rPr>
+        <w:t xml:space="preserve"> </w:t>
+      </w:r>
+      <w:proofErr w:type="spellStart"/>
+      <w:r>
+        <w:rPr>
+          <w:rFonts w:ascii="Times New Roman" w:hAnsi="Times New Roman" w:cs="Times New Roman"/>
+        </w:rPr>
+        <w:t>vehicul</w:t>
+      </w:r>
+      <w:proofErr w:type="spellEnd"/>
+      <w:r>
+        <w:rPr>
+          <w:rFonts w:ascii="Times New Roman" w:hAnsi="Times New Roman" w:cs="Times New Roman"/>
+        </w:rPr>
+        <w:t>.</w:t>
+      </w:r>
+    </w:p>
+    <w:p>
+      <w:pPr>
+        <w:rPr>
+          <w:rFonts w:ascii="Times New Roman" w:hAnsi="Times New Roman" w:cs="Times New Roman"/>
+        </w:rPr>
+      </w:pPr>
+      <w:r>
+        <w:rPr>
+          <w:rFonts w:ascii="Times New Roman" w:hAnsi="Times New Roman" w:cs="Times New Roman"/>
+        </w:rPr>
+        <w:t xml:space="preserve">CERERE_LISTARE: Este un document virtual (o </w:t>
+      </w:r>
+      <w:proofErr w:type="spellStart"/>
+      <w:r>
+        <w:rPr>
+          <w:rFonts w:ascii="Times New Roman" w:hAnsi="Times New Roman" w:cs="Times New Roman"/>
+        </w:rPr>
+        <w:t>tranzacție</w:t>
+      </w:r>
+      <w:proofErr w:type="spellEnd"/>
+      <w:r>
+        <w:rPr>
+          <w:rFonts w:ascii="Times New Roman" w:hAnsi="Times New Roman" w:cs="Times New Roman"/>
+        </w:rPr>
+        <w:t xml:space="preserve">) </w:t>
+      </w:r>
+      <w:proofErr w:type="spellStart"/>
+      <w:r>
+        <w:rPr>
+          <w:rFonts w:ascii="Times New Roman" w:hAnsi="Times New Roman" w:cs="Times New Roman"/>
+        </w:rPr>
+        <w:t>generat</w:t>
+      </w:r>
+      <w:proofErr w:type="spellEnd"/>
+      <w:r>
+        <w:rPr>
+          <w:rFonts w:ascii="Times New Roman" w:hAnsi="Times New Roman" w:cs="Times New Roman"/>
+        </w:rPr>
+        <w:t xml:space="preserve"> de un client care </w:t>
+      </w:r>
+      <w:proofErr w:type="spellStart"/>
+      <w:r>
+        <w:rPr>
+          <w:rFonts w:ascii="Times New Roman" w:hAnsi="Times New Roman" w:cs="Times New Roman"/>
+        </w:rPr>
+        <w:t>solicită</w:t>
+      </w:r>
+      <w:proofErr w:type="spellEnd"/>
+      <w:r>
+        <w:rPr>
+          <w:rFonts w:ascii="Times New Roman" w:hAnsi="Times New Roman" w:cs="Times New Roman"/>
+        </w:rPr>
+        <w:t xml:space="preserve"> </w:t>
+      </w:r>
+      <w:proofErr w:type="spellStart"/>
+      <w:r>
+        <w:rPr>
+          <w:rFonts w:ascii="Times New Roman" w:hAnsi="Times New Roman" w:cs="Times New Roman"/>
+        </w:rPr>
+        <w:t>introducerea</w:t>
+      </w:r>
+      <w:proofErr w:type="spellEnd"/>
+      <w:r>
+        <w:rPr>
+          <w:rFonts w:ascii="Times New Roman" w:hAnsi="Times New Roman" w:cs="Times New Roman"/>
+        </w:rPr>
+        <w:t xml:space="preserve"> </w:t>
+      </w:r>
+      <w:proofErr w:type="spellStart"/>
+      <w:r>
+        <w:rPr>
+          <w:rFonts w:ascii="Times New Roman" w:hAnsi="Times New Roman" w:cs="Times New Roman"/>
+        </w:rPr>
+        <w:t>unei</w:t>
+      </w:r>
+      <w:proofErr w:type="spellEnd"/>
+      <w:r>
+        <w:rPr>
+          <w:rFonts w:ascii="Times New Roman" w:hAnsi="Times New Roman" w:cs="Times New Roman"/>
+        </w:rPr>
+        <w:t xml:space="preserve"> </w:t>
+      </w:r>
+      <w:proofErr w:type="spellStart"/>
+      <w:r>
+        <w:rPr>
+          <w:rFonts w:ascii="Times New Roman" w:hAnsi="Times New Roman" w:cs="Times New Roman"/>
+        </w:rPr>
+        <w:t>mașini</w:t>
+      </w:r>
+      <w:proofErr w:type="spellEnd"/>
+      <w:r>
+        <w:rPr>
+          <w:rFonts w:ascii="Times New Roman" w:hAnsi="Times New Roman" w:cs="Times New Roman"/>
+        </w:rPr>
+        <w:t xml:space="preserve"> </w:t>
+      </w:r>
+      <w:proofErr w:type="spellStart"/>
+      <w:r>
+        <w:rPr>
+          <w:rFonts w:ascii="Times New Roman" w:hAnsi="Times New Roman" w:cs="Times New Roman"/>
+        </w:rPr>
+        <w:t>în</w:t>
+      </w:r>
+      <w:proofErr w:type="spellEnd"/>
+      <w:r>
+        <w:rPr>
+          <w:rFonts w:ascii="Times New Roman" w:hAnsi="Times New Roman" w:cs="Times New Roman"/>
+        </w:rPr>
+        <w:t xml:space="preserve"> </w:t>
+      </w:r>
+      <w:proofErr w:type="spellStart"/>
+      <w:r>
+        <w:rPr>
+          <w:rFonts w:ascii="Times New Roman" w:hAnsi="Times New Roman" w:cs="Times New Roman"/>
+        </w:rPr>
+        <w:t>târg</w:t>
+      </w:r>
+      <w:proofErr w:type="spellEnd"/>
+      <w:r>
+        <w:rPr>
+          <w:rFonts w:ascii="Times New Roman" w:hAnsi="Times New Roman" w:cs="Times New Roman"/>
+        </w:rPr>
+        <w:t>.</w:t>
+      </w:r>
+    </w:p>
+    <w:p>
+      <w:pPr>
+        <w:rPr>
+          <w:rFonts w:ascii="Times New Roman" w:hAnsi="Times New Roman" w:cs="Times New Roman"/>
+        </w:rPr>
+      </w:pPr>
+      <w:r>
+        <w:rPr>
+          <w:rFonts w:ascii="Times New Roman" w:hAnsi="Times New Roman" w:cs="Times New Roman"/>
+        </w:rPr>
+        <w:t xml:space="preserve">DOTARE: </w:t>
+      </w:r>
+      <w:proofErr w:type="spellStart"/>
+      <w:r>
+        <w:rPr>
+          <w:rFonts w:ascii="Times New Roman" w:hAnsi="Times New Roman" w:cs="Times New Roman"/>
+        </w:rPr>
+        <w:t>Entitate</w:t>
+      </w:r>
+      <w:proofErr w:type="spellEnd"/>
+      <w:r>
+        <w:rPr>
+          <w:rFonts w:ascii="Times New Roman" w:hAnsi="Times New Roman" w:cs="Times New Roman"/>
+        </w:rPr>
+        <w:t xml:space="preserve"> care </w:t>
+      </w:r>
+      <w:proofErr w:type="spellStart"/>
+      <w:r>
+        <w:rPr>
+          <w:rFonts w:ascii="Times New Roman" w:hAnsi="Times New Roman" w:cs="Times New Roman"/>
+        </w:rPr>
+        <w:t>stochează</w:t>
+      </w:r>
+      <w:proofErr w:type="spellEnd"/>
+      <w:r>
+        <w:rPr>
+          <w:rFonts w:ascii="Times New Roman" w:hAnsi="Times New Roman" w:cs="Times New Roman"/>
+        </w:rPr>
+        <w:t xml:space="preserve"> </w:t>
+      </w:r>
+      <w:proofErr w:type="spellStart"/>
+      <w:r>
+        <w:rPr>
+          <w:rFonts w:ascii="Times New Roman" w:hAnsi="Times New Roman" w:cs="Times New Roman"/>
+        </w:rPr>
+        <w:t>echipamentele</w:t>
+      </w:r>
+      <w:proofErr w:type="spellEnd"/>
+      <w:r>
+        <w:rPr>
+          <w:rFonts w:ascii="Times New Roman" w:hAnsi="Times New Roman" w:cs="Times New Roman"/>
+        </w:rPr>
+        <w:t xml:space="preserve"> </w:t>
+      </w:r>
+      <w:proofErr w:type="spellStart"/>
+      <w:r>
+        <w:rPr>
+          <w:rFonts w:ascii="Times New Roman" w:hAnsi="Times New Roman" w:cs="Times New Roman"/>
+        </w:rPr>
+        <w:t>opționale</w:t>
+      </w:r>
+      <w:proofErr w:type="spellEnd"/>
+      <w:r>
+        <w:rPr>
+          <w:rFonts w:ascii="Times New Roman" w:hAnsi="Times New Roman" w:cs="Times New Roman"/>
+        </w:rPr>
+        <w:t xml:space="preserve"> ale </w:t>
+      </w:r>
+      <w:proofErr w:type="spellStart"/>
+      <w:r>
+        <w:rPr>
+          <w:rFonts w:ascii="Times New Roman" w:hAnsi="Times New Roman" w:cs="Times New Roman"/>
+        </w:rPr>
+        <w:t>autovehiculelor</w:t>
+      </w:r>
+      <w:proofErr w:type="spellEnd"/>
+      <w:r>
+        <w:rPr>
+          <w:rFonts w:ascii="Times New Roman" w:hAnsi="Times New Roman" w:cs="Times New Roman"/>
+        </w:rPr>
+        <w:t>.</w:t>
+      </w:r>
+    </w:p>
+    <w:p>
+      <w:pPr>
+        <w:rPr>
+          <w:rFonts w:ascii="Times New Roman" w:hAnsi="Times New Roman" w:cs="Times New Roman"/>
+        </w:rPr>
+      </w:pPr>
+      <w:r>
+        <w:rPr>
+          <w:rFonts w:ascii="Times New Roman" w:hAnsi="Times New Roman" w:cs="Times New Roman"/>
+        </w:rPr>
+        <w:t xml:space="preserve">MARCA </w:t>
+      </w:r>
+      <w:proofErr w:type="spellStart"/>
+      <w:r>
+        <w:rPr>
+          <w:rFonts w:ascii="Times New Roman" w:hAnsi="Times New Roman" w:cs="Times New Roman"/>
+        </w:rPr>
+        <w:t>și</w:t>
+      </w:r>
+      <w:proofErr w:type="spellEnd"/>
+      <w:r>
+        <w:rPr>
+          <w:rFonts w:ascii="Times New Roman" w:hAnsi="Times New Roman" w:cs="Times New Roman"/>
+        </w:rPr>
+        <w:t xml:space="preserve"> MODEL: </w:t>
+      </w:r>
+      <w:proofErr w:type="spellStart"/>
+      <w:r>
+        <w:rPr>
+          <w:rFonts w:ascii="Times New Roman" w:hAnsi="Times New Roman" w:cs="Times New Roman"/>
+        </w:rPr>
+        <w:t>Entități</w:t>
+      </w:r>
+      <w:proofErr w:type="spellEnd"/>
+      <w:r>
+        <w:rPr>
+          <w:rFonts w:ascii="Times New Roman" w:hAnsi="Times New Roman" w:cs="Times New Roman"/>
+        </w:rPr>
+        <w:t xml:space="preserve"> de tip nomenclator, </w:t>
+      </w:r>
+      <w:proofErr w:type="spellStart"/>
+      <w:r>
+        <w:rPr>
+          <w:rFonts w:ascii="Times New Roman" w:hAnsi="Times New Roman" w:cs="Times New Roman"/>
+        </w:rPr>
+        <w:t>utilizate</w:t>
+      </w:r>
+      <w:proofErr w:type="spellEnd"/>
+      <w:r>
+        <w:rPr>
+          <w:rFonts w:ascii="Times New Roman" w:hAnsi="Times New Roman" w:cs="Times New Roman"/>
+        </w:rPr>
+        <w:t xml:space="preserve"> </w:t>
+      </w:r>
+      <w:proofErr w:type="spellStart"/>
+      <w:r>
+        <w:rPr>
+          <w:rFonts w:ascii="Times New Roman" w:hAnsi="Times New Roman" w:cs="Times New Roman"/>
+        </w:rPr>
+        <w:t>pentru</w:t>
+      </w:r>
+      <w:proofErr w:type="spellEnd"/>
+      <w:r>
+        <w:rPr>
+          <w:rFonts w:ascii="Times New Roman" w:hAnsi="Times New Roman" w:cs="Times New Roman"/>
+        </w:rPr>
+        <w:t xml:space="preserve"> a </w:t>
+      </w:r>
+      <w:proofErr w:type="spellStart"/>
+      <w:r>
+        <w:rPr>
+          <w:rFonts w:ascii="Times New Roman" w:hAnsi="Times New Roman" w:cs="Times New Roman"/>
+        </w:rPr>
+        <w:t>standardiza</w:t>
+      </w:r>
+      <w:proofErr w:type="spellEnd"/>
+      <w:r>
+        <w:rPr>
+          <w:rFonts w:ascii="Times New Roman" w:hAnsi="Times New Roman" w:cs="Times New Roman"/>
+        </w:rPr>
+        <w:t xml:space="preserve"> </w:t>
+      </w:r>
+      <w:proofErr w:type="spellStart"/>
+      <w:r>
+        <w:rPr>
+          <w:rFonts w:ascii="Times New Roman" w:hAnsi="Times New Roman" w:cs="Times New Roman"/>
+        </w:rPr>
+        <w:t>clasificarea</w:t>
+      </w:r>
+      <w:proofErr w:type="spellEnd"/>
+      <w:r>
+        <w:rPr>
+          <w:rFonts w:ascii="Times New Roman" w:hAnsi="Times New Roman" w:cs="Times New Roman"/>
+        </w:rPr>
+        <w:t xml:space="preserve"> </w:t>
+      </w:r>
+      <w:proofErr w:type="spellStart"/>
+      <w:r>
+        <w:rPr>
+          <w:rFonts w:ascii="Times New Roman" w:hAnsi="Times New Roman" w:cs="Times New Roman"/>
+        </w:rPr>
+        <w:t>autovehiculelor</w:t>
+      </w:r>
+      <w:proofErr w:type="spellEnd"/>
+      <w:r>
+        <w:rPr>
+          <w:rFonts w:ascii="Times New Roman" w:hAnsi="Times New Roman" w:cs="Times New Roman"/>
+        </w:rPr>
+        <w:t xml:space="preserve"> </w:t>
+      </w:r>
+      <w:proofErr w:type="spellStart"/>
+      <w:r>
+        <w:rPr>
+          <w:rFonts w:ascii="Times New Roman" w:hAnsi="Times New Roman" w:cs="Times New Roman"/>
+        </w:rPr>
+        <w:t>și</w:t>
+      </w:r>
+      <w:proofErr w:type="spellEnd"/>
+      <w:r>
+        <w:rPr>
+          <w:rFonts w:ascii="Times New Roman" w:hAnsi="Times New Roman" w:cs="Times New Roman"/>
+        </w:rPr>
+        <w:t xml:space="preserve"> </w:t>
+      </w:r>
+      <w:proofErr w:type="gramStart"/>
+      <w:r>
+        <w:rPr>
+          <w:rFonts w:ascii="Times New Roman" w:hAnsi="Times New Roman" w:cs="Times New Roman"/>
+        </w:rPr>
+        <w:t>a</w:t>
+      </w:r>
+      <w:proofErr w:type="gramEnd"/>
+      <w:r>
+        <w:rPr>
+          <w:rFonts w:ascii="Times New Roman" w:hAnsi="Times New Roman" w:cs="Times New Roman"/>
+        </w:rPr>
+        <w:t xml:space="preserve"> </w:t>
+      </w:r>
+      <w:proofErr w:type="spellStart"/>
+      <w:r>
+        <w:rPr>
+          <w:rFonts w:ascii="Times New Roman" w:hAnsi="Times New Roman" w:cs="Times New Roman"/>
+        </w:rPr>
+        <w:t>evita</w:t>
+      </w:r>
+      <w:proofErr w:type="spellEnd"/>
+      <w:r>
+        <w:rPr>
+          <w:rFonts w:ascii="Times New Roman" w:hAnsi="Times New Roman" w:cs="Times New Roman"/>
+        </w:rPr>
+        <w:t xml:space="preserve"> </w:t>
+      </w:r>
+      <w:proofErr w:type="spellStart"/>
+      <w:r>
+        <w:rPr>
+          <w:rFonts w:ascii="Times New Roman" w:hAnsi="Times New Roman" w:cs="Times New Roman"/>
+        </w:rPr>
+        <w:t>anomaliile</w:t>
+      </w:r>
+      <w:proofErr w:type="spellEnd"/>
+      <w:r>
+        <w:rPr>
+          <w:rFonts w:ascii="Times New Roman" w:hAnsi="Times New Roman" w:cs="Times New Roman"/>
+        </w:rPr>
+        <w:t xml:space="preserve"> de </w:t>
+      </w:r>
+      <w:proofErr w:type="spellStart"/>
+      <w:r>
+        <w:rPr>
+          <w:rFonts w:ascii="Times New Roman" w:hAnsi="Times New Roman" w:cs="Times New Roman"/>
+        </w:rPr>
+        <w:t>actualizare</w:t>
+      </w:r>
+      <w:proofErr w:type="spellEnd"/>
+      <w:r>
+        <w:rPr>
+          <w:rFonts w:ascii="Times New Roman" w:hAnsi="Times New Roman" w:cs="Times New Roman"/>
+        </w:rPr>
+        <w:t>.</w:t>
+      </w:r>
+    </w:p>
+    <w:p>
+      <w:pPr>
+        <w:rPr>
+          <w:rFonts w:ascii="Times New Roman" w:hAnsi="Times New Roman" w:cs="Times New Roman"/>
+        </w:rPr>
+      </w:pPr>
+      <w:r>
+        <w:rPr>
+          <w:rFonts w:ascii="Times New Roman" w:hAnsi="Times New Roman" w:cs="Times New Roman"/>
+        </w:rPr>
+        <w:t xml:space="preserve">ISTORIC_PROBLEME: </w:t>
+      </w:r>
+      <w:proofErr w:type="spellStart"/>
+      <w:r>
+        <w:rPr>
+          <w:rFonts w:ascii="Times New Roman" w:hAnsi="Times New Roman" w:cs="Times New Roman"/>
+        </w:rPr>
+        <w:t>Entitate</w:t>
+      </w:r>
+      <w:proofErr w:type="spellEnd"/>
+      <w:r>
+        <w:rPr>
+          <w:rFonts w:ascii="Times New Roman" w:hAnsi="Times New Roman" w:cs="Times New Roman"/>
+        </w:rPr>
+        <w:t xml:space="preserve"> </w:t>
+      </w:r>
+      <w:proofErr w:type="spellStart"/>
+      <w:r>
+        <w:rPr>
+          <w:rFonts w:ascii="Times New Roman" w:hAnsi="Times New Roman" w:cs="Times New Roman"/>
+        </w:rPr>
+        <w:t>dependentă</w:t>
+      </w:r>
+      <w:proofErr w:type="spellEnd"/>
+      <w:r>
+        <w:rPr>
+          <w:rFonts w:ascii="Times New Roman" w:hAnsi="Times New Roman" w:cs="Times New Roman"/>
+        </w:rPr>
+        <w:t xml:space="preserve"> </w:t>
+      </w:r>
+      <w:proofErr w:type="spellStart"/>
+      <w:r>
+        <w:rPr>
+          <w:rFonts w:ascii="Times New Roman" w:hAnsi="Times New Roman" w:cs="Times New Roman"/>
+        </w:rPr>
+        <w:t>ce</w:t>
+      </w:r>
+      <w:proofErr w:type="spellEnd"/>
+      <w:r>
+        <w:rPr>
+          <w:rFonts w:ascii="Times New Roman" w:hAnsi="Times New Roman" w:cs="Times New Roman"/>
+        </w:rPr>
+        <w:t xml:space="preserve"> </w:t>
+      </w:r>
+      <w:proofErr w:type="spellStart"/>
+      <w:r>
+        <w:rPr>
+          <w:rFonts w:ascii="Times New Roman" w:hAnsi="Times New Roman" w:cs="Times New Roman"/>
+        </w:rPr>
+        <w:t>stochează</w:t>
+      </w:r>
+      <w:proofErr w:type="spellEnd"/>
+      <w:r>
+        <w:rPr>
+          <w:rFonts w:ascii="Times New Roman" w:hAnsi="Times New Roman" w:cs="Times New Roman"/>
+        </w:rPr>
+        <w:t xml:space="preserve"> </w:t>
+      </w:r>
+      <w:proofErr w:type="spellStart"/>
+      <w:r>
+        <w:rPr>
+          <w:rFonts w:ascii="Times New Roman" w:hAnsi="Times New Roman" w:cs="Times New Roman"/>
+        </w:rPr>
+        <w:t>înregistrările</w:t>
+      </w:r>
+      <w:proofErr w:type="spellEnd"/>
+      <w:r>
+        <w:rPr>
+          <w:rFonts w:ascii="Times New Roman" w:hAnsi="Times New Roman" w:cs="Times New Roman"/>
+        </w:rPr>
+        <w:t xml:space="preserve"> de service </w:t>
+      </w:r>
+      <w:proofErr w:type="spellStart"/>
+      <w:r>
+        <w:rPr>
+          <w:rFonts w:ascii="Times New Roman" w:hAnsi="Times New Roman" w:cs="Times New Roman"/>
+        </w:rPr>
+        <w:t>sau</w:t>
+      </w:r>
+      <w:proofErr w:type="spellEnd"/>
+      <w:r>
+        <w:rPr>
+          <w:rFonts w:ascii="Times New Roman" w:hAnsi="Times New Roman" w:cs="Times New Roman"/>
+        </w:rPr>
+        <w:t xml:space="preserve"> </w:t>
+      </w:r>
+      <w:proofErr w:type="spellStart"/>
+      <w:r>
+        <w:rPr>
+          <w:rFonts w:ascii="Times New Roman" w:hAnsi="Times New Roman" w:cs="Times New Roman"/>
+        </w:rPr>
+        <w:t>defectele</w:t>
+      </w:r>
+      <w:proofErr w:type="spellEnd"/>
+      <w:r>
+        <w:rPr>
+          <w:rFonts w:ascii="Times New Roman" w:hAnsi="Times New Roman" w:cs="Times New Roman"/>
+        </w:rPr>
+        <w:t xml:space="preserve"> </w:t>
+      </w:r>
+      <w:proofErr w:type="spellStart"/>
+      <w:r>
+        <w:rPr>
+          <w:rFonts w:ascii="Times New Roman" w:hAnsi="Times New Roman" w:cs="Times New Roman"/>
+        </w:rPr>
+        <w:t>declarate</w:t>
+      </w:r>
+      <w:proofErr w:type="spellEnd"/>
+      <w:r>
+        <w:rPr>
+          <w:rFonts w:ascii="Times New Roman" w:hAnsi="Times New Roman" w:cs="Times New Roman"/>
+        </w:rPr>
+        <w:t xml:space="preserve"> ale </w:t>
+      </w:r>
+      <w:proofErr w:type="spellStart"/>
+      <w:r>
+        <w:rPr>
+          <w:rFonts w:ascii="Times New Roman" w:hAnsi="Times New Roman" w:cs="Times New Roman"/>
+        </w:rPr>
+        <w:t>unei</w:t>
+      </w:r>
+      <w:proofErr w:type="spellEnd"/>
+      <w:r>
+        <w:rPr>
+          <w:rFonts w:ascii="Times New Roman" w:hAnsi="Times New Roman" w:cs="Times New Roman"/>
+        </w:rPr>
+        <w:t xml:space="preserve"> </w:t>
+      </w:r>
+      <w:proofErr w:type="spellStart"/>
+      <w:r>
+        <w:rPr>
+          <w:rFonts w:ascii="Times New Roman" w:hAnsi="Times New Roman" w:cs="Times New Roman"/>
+        </w:rPr>
+        <w:t>mașini</w:t>
+      </w:r>
+      <w:proofErr w:type="spellEnd"/>
+      <w:r>
+        <w:rPr>
+          <w:rFonts w:ascii="Times New Roman" w:hAnsi="Times New Roman" w:cs="Times New Roman"/>
+        </w:rPr>
+        <w:t>.</w:t>
+      </w:r>
+    </w:p>
+    <w:p>
+      <w:pPr>
+        <w:rPr>
+          <w:rFonts w:ascii="Times New Roman" w:hAnsi="Times New Roman" w:cs="Times New Roman"/>
+        </w:rPr>
+      </w:pPr>
+      <w:r>
+        <w:rPr>
+          <w:rFonts w:ascii="Times New Roman" w:hAnsi="Times New Roman" w:cs="Times New Roman"/>
+        </w:rPr>
+        <w:t xml:space="preserve">2. </w:t>
+      </w:r>
+      <w:proofErr w:type="spellStart"/>
+      <w:r>
+        <w:rPr>
+          <w:rFonts w:ascii="Times New Roman" w:hAnsi="Times New Roman" w:cs="Times New Roman"/>
+        </w:rPr>
+        <w:t>Definirea</w:t>
+      </w:r>
+      <w:proofErr w:type="spellEnd"/>
+      <w:r>
+        <w:rPr>
+          <w:rFonts w:ascii="Times New Roman" w:hAnsi="Times New Roman" w:cs="Times New Roman"/>
+        </w:rPr>
+        <w:t xml:space="preserve"> </w:t>
+      </w:r>
+      <w:proofErr w:type="spellStart"/>
+      <w:r>
+        <w:rPr>
+          <w:rFonts w:ascii="Times New Roman" w:hAnsi="Times New Roman" w:cs="Times New Roman"/>
+        </w:rPr>
+        <w:t>Relațiilor</w:t>
+      </w:r>
+      <w:proofErr w:type="spellEnd"/>
+      <w:r>
+        <w:rPr>
+          <w:rFonts w:ascii="Times New Roman" w:hAnsi="Times New Roman" w:cs="Times New Roman"/>
+        </w:rPr>
+        <w:t xml:space="preserve"> </w:t>
+      </w:r>
+      <w:proofErr w:type="spellStart"/>
+      <w:r>
+        <w:rPr>
+          <w:rFonts w:ascii="Times New Roman" w:hAnsi="Times New Roman" w:cs="Times New Roman"/>
+        </w:rPr>
+        <w:t>și</w:t>
+      </w:r>
+      <w:proofErr w:type="spellEnd"/>
+      <w:r>
+        <w:rPr>
+          <w:rFonts w:ascii="Times New Roman" w:hAnsi="Times New Roman" w:cs="Times New Roman"/>
+        </w:rPr>
+        <w:t xml:space="preserve"> a </w:t>
+      </w:r>
+      <w:proofErr w:type="spellStart"/>
+      <w:r>
+        <w:rPr>
+          <w:rFonts w:ascii="Times New Roman" w:hAnsi="Times New Roman" w:cs="Times New Roman"/>
+        </w:rPr>
+        <w:t>Regulilor</w:t>
+      </w:r>
+      <w:proofErr w:type="spellEnd"/>
+      <w:r>
+        <w:rPr>
+          <w:rFonts w:ascii="Times New Roman" w:hAnsi="Times New Roman" w:cs="Times New Roman"/>
+        </w:rPr>
+        <w:t xml:space="preserve"> de Business </w:t>
+      </w:r>
+    </w:p>
+    <w:p>
+      <w:pPr>
+        <w:rPr>
+          <w:rFonts w:ascii="Times New Roman" w:hAnsi="Times New Roman" w:cs="Times New Roman"/>
+        </w:rPr>
+      </w:pPr>
+      <w:proofErr w:type="spellStart"/>
+      <w:r>
+        <w:rPr>
+          <w:rFonts w:ascii="Times New Roman" w:hAnsi="Times New Roman" w:cs="Times New Roman"/>
+        </w:rPr>
+        <w:t>Fluxul</w:t>
+      </w:r>
+      <w:proofErr w:type="spellEnd"/>
+      <w:r>
+        <w:rPr>
+          <w:rFonts w:ascii="Times New Roman" w:hAnsi="Times New Roman" w:cs="Times New Roman"/>
+        </w:rPr>
+        <w:t xml:space="preserve"> de </w:t>
+      </w:r>
+      <w:proofErr w:type="spellStart"/>
+      <w:r>
+        <w:rPr>
+          <w:rFonts w:ascii="Times New Roman" w:hAnsi="Times New Roman" w:cs="Times New Roman"/>
+        </w:rPr>
+        <w:t>listare</w:t>
+      </w:r>
+      <w:proofErr w:type="spellEnd"/>
+      <w:r>
+        <w:rPr>
+          <w:rFonts w:ascii="Times New Roman" w:hAnsi="Times New Roman" w:cs="Times New Roman"/>
+        </w:rPr>
+        <w:t xml:space="preserve"> (UTILIZATOR - CERERE_LISTARE): Un UTILIZATOR (cu </w:t>
+      </w:r>
+      <w:proofErr w:type="spellStart"/>
+      <w:r>
+        <w:rPr>
+          <w:rFonts w:ascii="Times New Roman" w:hAnsi="Times New Roman" w:cs="Times New Roman"/>
+        </w:rPr>
+        <w:t>rol</w:t>
+      </w:r>
+      <w:proofErr w:type="spellEnd"/>
+      <w:r>
+        <w:rPr>
+          <w:rFonts w:ascii="Times New Roman" w:hAnsi="Times New Roman" w:cs="Times New Roman"/>
+        </w:rPr>
+        <w:t xml:space="preserve"> de client) </w:t>
+      </w:r>
+      <w:proofErr w:type="spellStart"/>
+      <w:r>
+        <w:rPr>
+          <w:rFonts w:ascii="Times New Roman" w:hAnsi="Times New Roman" w:cs="Times New Roman"/>
+        </w:rPr>
+        <w:t>poate</w:t>
+      </w:r>
+      <w:proofErr w:type="spellEnd"/>
+      <w:r>
+        <w:rPr>
+          <w:rFonts w:ascii="Times New Roman" w:hAnsi="Times New Roman" w:cs="Times New Roman"/>
+        </w:rPr>
+        <w:t xml:space="preserve"> </w:t>
+      </w:r>
+      <w:proofErr w:type="spellStart"/>
+      <w:r>
+        <w:rPr>
+          <w:rFonts w:ascii="Times New Roman" w:hAnsi="Times New Roman" w:cs="Times New Roman"/>
+        </w:rPr>
+        <w:t>depune</w:t>
+      </w:r>
+      <w:proofErr w:type="spellEnd"/>
+      <w:r>
+        <w:rPr>
+          <w:rFonts w:ascii="Times New Roman" w:hAnsi="Times New Roman" w:cs="Times New Roman"/>
+        </w:rPr>
+        <w:t xml:space="preserve"> zero </w:t>
+      </w:r>
+      <w:proofErr w:type="spellStart"/>
+      <w:r>
+        <w:rPr>
+          <w:rFonts w:ascii="Times New Roman" w:hAnsi="Times New Roman" w:cs="Times New Roman"/>
+        </w:rPr>
+        <w:t>sau</w:t>
+      </w:r>
+      <w:proofErr w:type="spellEnd"/>
+      <w:r>
+        <w:rPr>
+          <w:rFonts w:ascii="Times New Roman" w:hAnsi="Times New Roman" w:cs="Times New Roman"/>
+        </w:rPr>
+        <w:t xml:space="preserve"> </w:t>
+      </w:r>
+      <w:proofErr w:type="spellStart"/>
+      <w:r>
+        <w:rPr>
+          <w:rFonts w:ascii="Times New Roman" w:hAnsi="Times New Roman" w:cs="Times New Roman"/>
+        </w:rPr>
+        <w:t>mai</w:t>
+      </w:r>
+      <w:proofErr w:type="spellEnd"/>
+      <w:r>
+        <w:rPr>
+          <w:rFonts w:ascii="Times New Roman" w:hAnsi="Times New Roman" w:cs="Times New Roman"/>
+        </w:rPr>
+        <w:t xml:space="preserve"> </w:t>
+      </w:r>
+      <w:proofErr w:type="spellStart"/>
+      <w:r>
+        <w:rPr>
+          <w:rFonts w:ascii="Times New Roman" w:hAnsi="Times New Roman" w:cs="Times New Roman"/>
+        </w:rPr>
+        <w:t>multe</w:t>
+      </w:r>
+      <w:proofErr w:type="spellEnd"/>
+      <w:r>
+        <w:rPr>
+          <w:rFonts w:ascii="Times New Roman" w:hAnsi="Times New Roman" w:cs="Times New Roman"/>
+        </w:rPr>
+        <w:t xml:space="preserve"> </w:t>
+      </w:r>
+      <w:proofErr w:type="spellStart"/>
+      <w:r>
+        <w:rPr>
+          <w:rFonts w:ascii="Times New Roman" w:hAnsi="Times New Roman" w:cs="Times New Roman"/>
+        </w:rPr>
+        <w:t>entități</w:t>
+      </w:r>
+      <w:proofErr w:type="spellEnd"/>
+      <w:r>
+        <w:rPr>
+          <w:rFonts w:ascii="Times New Roman" w:hAnsi="Times New Roman" w:cs="Times New Roman"/>
+        </w:rPr>
+        <w:t xml:space="preserve"> de tip CERERE_LISTARE (</w:t>
+      </w:r>
+      <w:proofErr w:type="spellStart"/>
+      <w:r>
+        <w:rPr>
+          <w:rFonts w:ascii="Times New Roman" w:hAnsi="Times New Roman" w:cs="Times New Roman"/>
+        </w:rPr>
+        <w:t>Relație</w:t>
+      </w:r>
+      <w:proofErr w:type="spellEnd"/>
+      <w:r>
+        <w:rPr>
+          <w:rFonts w:ascii="Times New Roman" w:hAnsi="Times New Roman" w:cs="Times New Roman"/>
+        </w:rPr>
+        <w:t xml:space="preserve"> </w:t>
+      </w:r>
+      <w:proofErr w:type="gramStart"/>
+      <w:r>
+        <w:rPr>
+          <w:rFonts w:ascii="Times New Roman" w:hAnsi="Times New Roman" w:cs="Times New Roman"/>
+        </w:rPr>
+        <w:t>1:N</w:t>
+      </w:r>
+      <w:proofErr w:type="gramEnd"/>
+      <w:r>
+        <w:rPr>
+          <w:rFonts w:ascii="Times New Roman" w:hAnsi="Times New Roman" w:cs="Times New Roman"/>
+        </w:rPr>
+        <w:t xml:space="preserve">). O </w:t>
+      </w:r>
+      <w:proofErr w:type="spellStart"/>
+      <w:r>
+        <w:rPr>
+          <w:rFonts w:ascii="Times New Roman" w:hAnsi="Times New Roman" w:cs="Times New Roman"/>
+        </w:rPr>
+        <w:t>cerere</w:t>
+      </w:r>
+      <w:proofErr w:type="spellEnd"/>
+      <w:r>
+        <w:rPr>
+          <w:rFonts w:ascii="Times New Roman" w:hAnsi="Times New Roman" w:cs="Times New Roman"/>
+        </w:rPr>
+        <w:t xml:space="preserve"> </w:t>
+      </w:r>
+      <w:proofErr w:type="spellStart"/>
+      <w:r>
+        <w:rPr>
+          <w:rFonts w:ascii="Times New Roman" w:hAnsi="Times New Roman" w:cs="Times New Roman"/>
+        </w:rPr>
+        <w:t>aparține</w:t>
+      </w:r>
+      <w:proofErr w:type="spellEnd"/>
+      <w:r>
+        <w:rPr>
+          <w:rFonts w:ascii="Times New Roman" w:hAnsi="Times New Roman" w:cs="Times New Roman"/>
+        </w:rPr>
+        <w:t xml:space="preserve"> strict </w:t>
+      </w:r>
+      <w:proofErr w:type="spellStart"/>
+      <w:r>
+        <w:rPr>
+          <w:rFonts w:ascii="Times New Roman" w:hAnsi="Times New Roman" w:cs="Times New Roman"/>
+        </w:rPr>
+        <w:t>unui</w:t>
+      </w:r>
+      <w:proofErr w:type="spellEnd"/>
+      <w:r>
+        <w:rPr>
+          <w:rFonts w:ascii="Times New Roman" w:hAnsi="Times New Roman" w:cs="Times New Roman"/>
+        </w:rPr>
+        <w:t xml:space="preserve"> </w:t>
+      </w:r>
+      <w:proofErr w:type="spellStart"/>
+      <w:r>
+        <w:rPr>
+          <w:rFonts w:ascii="Times New Roman" w:hAnsi="Times New Roman" w:cs="Times New Roman"/>
+        </w:rPr>
+        <w:t>singur</w:t>
+      </w:r>
+      <w:proofErr w:type="spellEnd"/>
+      <w:r>
+        <w:rPr>
+          <w:rFonts w:ascii="Times New Roman" w:hAnsi="Times New Roman" w:cs="Times New Roman"/>
+        </w:rPr>
+        <w:t xml:space="preserve"> </w:t>
+      </w:r>
+      <w:proofErr w:type="spellStart"/>
+      <w:r>
+        <w:rPr>
+          <w:rFonts w:ascii="Times New Roman" w:hAnsi="Times New Roman" w:cs="Times New Roman"/>
+        </w:rPr>
+        <w:t>utilizator</w:t>
+      </w:r>
+      <w:proofErr w:type="spellEnd"/>
+      <w:r>
+        <w:rPr>
+          <w:rFonts w:ascii="Times New Roman" w:hAnsi="Times New Roman" w:cs="Times New Roman"/>
+        </w:rPr>
+        <w:t>.</w:t>
+      </w:r>
+    </w:p>
+    <w:p>
+      <w:pPr>
+        <w:rPr>
+          <w:rFonts w:ascii="Times New Roman" w:hAnsi="Times New Roman" w:cs="Times New Roman"/>
+        </w:rPr>
+      </w:pPr>
+      <w:proofErr w:type="spellStart"/>
+      <w:r>
+        <w:rPr>
+          <w:rFonts w:ascii="Times New Roman" w:hAnsi="Times New Roman" w:cs="Times New Roman"/>
+        </w:rPr>
+        <w:t>Gestiunea</w:t>
+      </w:r>
+      <w:proofErr w:type="spellEnd"/>
+      <w:r>
+        <w:rPr>
+          <w:rFonts w:ascii="Times New Roman" w:hAnsi="Times New Roman" w:cs="Times New Roman"/>
+        </w:rPr>
+        <w:t xml:space="preserve"> </w:t>
+      </w:r>
+      <w:proofErr w:type="spellStart"/>
+      <w:r>
+        <w:rPr>
+          <w:rFonts w:ascii="Times New Roman" w:hAnsi="Times New Roman" w:cs="Times New Roman"/>
+        </w:rPr>
+        <w:t>spațiului</w:t>
+      </w:r>
+      <w:proofErr w:type="spellEnd"/>
+      <w:r>
+        <w:rPr>
+          <w:rFonts w:ascii="Times New Roman" w:hAnsi="Times New Roman" w:cs="Times New Roman"/>
+        </w:rPr>
+        <w:t xml:space="preserve"> </w:t>
+      </w:r>
+      <w:proofErr w:type="spellStart"/>
+      <w:r>
+        <w:rPr>
+          <w:rFonts w:ascii="Times New Roman" w:hAnsi="Times New Roman" w:cs="Times New Roman"/>
+        </w:rPr>
+        <w:t>fizic</w:t>
+      </w:r>
+      <w:proofErr w:type="spellEnd"/>
+      <w:r>
+        <w:rPr>
+          <w:rFonts w:ascii="Times New Roman" w:hAnsi="Times New Roman" w:cs="Times New Roman"/>
+        </w:rPr>
+        <w:t xml:space="preserve"> (MASINA - LOC_PARCARE): </w:t>
+      </w:r>
+      <w:proofErr w:type="spellStart"/>
+      <w:r>
+        <w:rPr>
+          <w:rFonts w:ascii="Times New Roman" w:hAnsi="Times New Roman" w:cs="Times New Roman"/>
+        </w:rPr>
+        <w:t>Există</w:t>
+      </w:r>
+      <w:proofErr w:type="spellEnd"/>
+      <w:r>
+        <w:rPr>
+          <w:rFonts w:ascii="Times New Roman" w:hAnsi="Times New Roman" w:cs="Times New Roman"/>
+        </w:rPr>
+        <w:t xml:space="preserve"> o </w:t>
+      </w:r>
+      <w:proofErr w:type="spellStart"/>
+      <w:r>
+        <w:rPr>
+          <w:rFonts w:ascii="Times New Roman" w:hAnsi="Times New Roman" w:cs="Times New Roman"/>
+        </w:rPr>
+        <w:t>constrângere</w:t>
+      </w:r>
+      <w:proofErr w:type="spellEnd"/>
+      <w:r>
+        <w:rPr>
+          <w:rFonts w:ascii="Times New Roman" w:hAnsi="Times New Roman" w:cs="Times New Roman"/>
+        </w:rPr>
+        <w:t xml:space="preserve"> </w:t>
+      </w:r>
+      <w:proofErr w:type="spellStart"/>
+      <w:r>
+        <w:rPr>
+          <w:rFonts w:ascii="Times New Roman" w:hAnsi="Times New Roman" w:cs="Times New Roman"/>
+        </w:rPr>
+        <w:t>strictă</w:t>
+      </w:r>
+      <w:proofErr w:type="spellEnd"/>
+      <w:r>
+        <w:rPr>
+          <w:rFonts w:ascii="Times New Roman" w:hAnsi="Times New Roman" w:cs="Times New Roman"/>
+        </w:rPr>
+        <w:t xml:space="preserve"> de capacitate. O MASINA </w:t>
+      </w:r>
+      <w:proofErr w:type="spellStart"/>
+      <w:r>
+        <w:rPr>
+          <w:rFonts w:ascii="Times New Roman" w:hAnsi="Times New Roman" w:cs="Times New Roman"/>
+        </w:rPr>
+        <w:t>validată</w:t>
+      </w:r>
+      <w:proofErr w:type="spellEnd"/>
+      <w:r>
+        <w:rPr>
+          <w:rFonts w:ascii="Times New Roman" w:hAnsi="Times New Roman" w:cs="Times New Roman"/>
+        </w:rPr>
+        <w:t xml:space="preserve"> </w:t>
+      </w:r>
+      <w:proofErr w:type="spellStart"/>
+      <w:r>
+        <w:rPr>
+          <w:rFonts w:ascii="Times New Roman" w:hAnsi="Times New Roman" w:cs="Times New Roman"/>
+        </w:rPr>
+        <w:t>ocupă</w:t>
+      </w:r>
+      <w:proofErr w:type="spellEnd"/>
+      <w:r>
+        <w:rPr>
+          <w:rFonts w:ascii="Times New Roman" w:hAnsi="Times New Roman" w:cs="Times New Roman"/>
+        </w:rPr>
+        <w:t xml:space="preserve"> un </w:t>
+      </w:r>
+      <w:proofErr w:type="spellStart"/>
+      <w:r>
+        <w:rPr>
+          <w:rFonts w:ascii="Times New Roman" w:hAnsi="Times New Roman" w:cs="Times New Roman"/>
+        </w:rPr>
+        <w:t>singur</w:t>
+      </w:r>
+      <w:proofErr w:type="spellEnd"/>
+      <w:r>
+        <w:rPr>
+          <w:rFonts w:ascii="Times New Roman" w:hAnsi="Times New Roman" w:cs="Times New Roman"/>
+        </w:rPr>
+        <w:t xml:space="preserve"> LOC_PARCARE, </w:t>
+      </w:r>
+      <w:proofErr w:type="spellStart"/>
+      <w:r>
+        <w:rPr>
+          <w:rFonts w:ascii="Times New Roman" w:hAnsi="Times New Roman" w:cs="Times New Roman"/>
+        </w:rPr>
+        <w:t>iar</w:t>
+      </w:r>
+      <w:proofErr w:type="spellEnd"/>
+      <w:r>
+        <w:rPr>
+          <w:rFonts w:ascii="Times New Roman" w:hAnsi="Times New Roman" w:cs="Times New Roman"/>
+        </w:rPr>
+        <w:t xml:space="preserve"> </w:t>
+      </w:r>
+      <w:proofErr w:type="gramStart"/>
+      <w:r>
+        <w:rPr>
+          <w:rFonts w:ascii="Times New Roman" w:hAnsi="Times New Roman" w:cs="Times New Roman"/>
+        </w:rPr>
+        <w:t>un LOC</w:t>
+      </w:r>
+      <w:proofErr w:type="gramEnd"/>
+      <w:r>
+        <w:rPr>
+          <w:rFonts w:ascii="Times New Roman" w:hAnsi="Times New Roman" w:cs="Times New Roman"/>
+        </w:rPr>
+        <w:t xml:space="preserve">_PARCARE </w:t>
+      </w:r>
+      <w:proofErr w:type="spellStart"/>
+      <w:r>
+        <w:rPr>
+          <w:rFonts w:ascii="Times New Roman" w:hAnsi="Times New Roman" w:cs="Times New Roman"/>
+        </w:rPr>
+        <w:t>poate</w:t>
+      </w:r>
+      <w:proofErr w:type="spellEnd"/>
+      <w:r>
+        <w:rPr>
+          <w:rFonts w:ascii="Times New Roman" w:hAnsi="Times New Roman" w:cs="Times New Roman"/>
+        </w:rPr>
+        <w:t xml:space="preserve"> </w:t>
+      </w:r>
+      <w:proofErr w:type="spellStart"/>
+      <w:r>
+        <w:rPr>
+          <w:rFonts w:ascii="Times New Roman" w:hAnsi="Times New Roman" w:cs="Times New Roman"/>
+        </w:rPr>
+        <w:t>găzdui</w:t>
+      </w:r>
+      <w:proofErr w:type="spellEnd"/>
+      <w:r>
+        <w:rPr>
+          <w:rFonts w:ascii="Times New Roman" w:hAnsi="Times New Roman" w:cs="Times New Roman"/>
+        </w:rPr>
+        <w:t xml:space="preserve"> </w:t>
+      </w:r>
+      <w:proofErr w:type="spellStart"/>
+      <w:r>
+        <w:rPr>
+          <w:rFonts w:ascii="Times New Roman" w:hAnsi="Times New Roman" w:cs="Times New Roman"/>
+        </w:rPr>
+        <w:t>simultan</w:t>
+      </w:r>
+      <w:proofErr w:type="spellEnd"/>
+      <w:r>
+        <w:rPr>
+          <w:rFonts w:ascii="Times New Roman" w:hAnsi="Times New Roman" w:cs="Times New Roman"/>
+        </w:rPr>
+        <w:t xml:space="preserve"> cel </w:t>
+      </w:r>
+      <w:proofErr w:type="spellStart"/>
+      <w:r>
+        <w:rPr>
+          <w:rFonts w:ascii="Times New Roman" w:hAnsi="Times New Roman" w:cs="Times New Roman"/>
+        </w:rPr>
+        <w:t>mult</w:t>
+      </w:r>
+      <w:proofErr w:type="spellEnd"/>
+      <w:r>
+        <w:rPr>
+          <w:rFonts w:ascii="Times New Roman" w:hAnsi="Times New Roman" w:cs="Times New Roman"/>
+        </w:rPr>
+        <w:t xml:space="preserve"> o </w:t>
+      </w:r>
+      <w:proofErr w:type="spellStart"/>
+      <w:r>
+        <w:rPr>
+          <w:rFonts w:ascii="Times New Roman" w:hAnsi="Times New Roman" w:cs="Times New Roman"/>
+        </w:rPr>
+        <w:t>singură</w:t>
+      </w:r>
+      <w:proofErr w:type="spellEnd"/>
+      <w:r>
+        <w:rPr>
+          <w:rFonts w:ascii="Times New Roman" w:hAnsi="Times New Roman" w:cs="Times New Roman"/>
+        </w:rPr>
+        <w:t xml:space="preserve"> MASINA (</w:t>
+      </w:r>
+      <w:proofErr w:type="spellStart"/>
+      <w:r>
+        <w:rPr>
+          <w:rFonts w:ascii="Times New Roman" w:hAnsi="Times New Roman" w:cs="Times New Roman"/>
+        </w:rPr>
+        <w:t>Relație</w:t>
+      </w:r>
+      <w:proofErr w:type="spellEnd"/>
+      <w:r>
+        <w:rPr>
+          <w:rFonts w:ascii="Times New Roman" w:hAnsi="Times New Roman" w:cs="Times New Roman"/>
+        </w:rPr>
+        <w:t xml:space="preserve"> 1:1).</w:t>
+      </w:r>
+    </w:p>
+    <w:p>
+      <w:pPr>
+        <w:rPr>
+          <w:rFonts w:ascii="Times New Roman" w:hAnsi="Times New Roman" w:cs="Times New Roman"/>
+        </w:rPr>
+      </w:pPr>
+      <w:proofErr w:type="spellStart"/>
+      <w:r>
+        <w:rPr>
+          <w:rFonts w:ascii="Times New Roman" w:hAnsi="Times New Roman" w:cs="Times New Roman"/>
+        </w:rPr>
+        <w:t>Clasificarea</w:t>
+      </w:r>
+      <w:proofErr w:type="spellEnd"/>
+      <w:r>
+        <w:rPr>
+          <w:rFonts w:ascii="Times New Roman" w:hAnsi="Times New Roman" w:cs="Times New Roman"/>
+        </w:rPr>
+        <w:t xml:space="preserve"> </w:t>
+      </w:r>
+      <w:proofErr w:type="spellStart"/>
+      <w:r>
+        <w:rPr>
+          <w:rFonts w:ascii="Times New Roman" w:hAnsi="Times New Roman" w:cs="Times New Roman"/>
+        </w:rPr>
+        <w:t>vehiculelor</w:t>
+      </w:r>
+      <w:proofErr w:type="spellEnd"/>
+      <w:r>
+        <w:rPr>
+          <w:rFonts w:ascii="Times New Roman" w:hAnsi="Times New Roman" w:cs="Times New Roman"/>
+        </w:rPr>
+        <w:t xml:space="preserve"> (MARCA - MODEL - MASINA): O MARCA produce </w:t>
+      </w:r>
+      <w:proofErr w:type="spellStart"/>
+      <w:r>
+        <w:rPr>
+          <w:rFonts w:ascii="Times New Roman" w:hAnsi="Times New Roman" w:cs="Times New Roman"/>
+        </w:rPr>
+        <w:t>mai</w:t>
+      </w:r>
+      <w:proofErr w:type="spellEnd"/>
+      <w:r>
+        <w:rPr>
+          <w:rFonts w:ascii="Times New Roman" w:hAnsi="Times New Roman" w:cs="Times New Roman"/>
+        </w:rPr>
+        <w:t xml:space="preserve"> </w:t>
+      </w:r>
+      <w:proofErr w:type="spellStart"/>
+      <w:r>
+        <w:rPr>
+          <w:rFonts w:ascii="Times New Roman" w:hAnsi="Times New Roman" w:cs="Times New Roman"/>
+        </w:rPr>
+        <w:t>multe</w:t>
+      </w:r>
+      <w:proofErr w:type="spellEnd"/>
+      <w:r>
+        <w:rPr>
+          <w:rFonts w:ascii="Times New Roman" w:hAnsi="Times New Roman" w:cs="Times New Roman"/>
+        </w:rPr>
+        <w:t xml:space="preserve"> </w:t>
+      </w:r>
+      <w:proofErr w:type="spellStart"/>
+      <w:r>
+        <w:rPr>
+          <w:rFonts w:ascii="Times New Roman" w:hAnsi="Times New Roman" w:cs="Times New Roman"/>
+        </w:rPr>
+        <w:t>entități</w:t>
+      </w:r>
+      <w:proofErr w:type="spellEnd"/>
+      <w:r>
+        <w:rPr>
+          <w:rFonts w:ascii="Times New Roman" w:hAnsi="Times New Roman" w:cs="Times New Roman"/>
+        </w:rPr>
+        <w:t xml:space="preserve"> de tip MODEL (</w:t>
+      </w:r>
+      <w:proofErr w:type="gramStart"/>
+      <w:r>
+        <w:rPr>
+          <w:rFonts w:ascii="Times New Roman" w:hAnsi="Times New Roman" w:cs="Times New Roman"/>
+        </w:rPr>
+        <w:t>1:N</w:t>
+      </w:r>
+      <w:proofErr w:type="gramEnd"/>
+      <w:r>
+        <w:rPr>
+          <w:rFonts w:ascii="Times New Roman" w:hAnsi="Times New Roman" w:cs="Times New Roman"/>
+        </w:rPr>
+        <w:t xml:space="preserve">). Mai </w:t>
+      </w:r>
+      <w:proofErr w:type="spellStart"/>
+      <w:r>
+        <w:rPr>
+          <w:rFonts w:ascii="Times New Roman" w:hAnsi="Times New Roman" w:cs="Times New Roman"/>
+        </w:rPr>
+        <w:t>departe</w:t>
+      </w:r>
+      <w:proofErr w:type="spellEnd"/>
+      <w:r>
+        <w:rPr>
+          <w:rFonts w:ascii="Times New Roman" w:hAnsi="Times New Roman" w:cs="Times New Roman"/>
+        </w:rPr>
+        <w:t xml:space="preserve">, </w:t>
+      </w:r>
+      <w:proofErr w:type="gramStart"/>
+      <w:r>
+        <w:rPr>
+          <w:rFonts w:ascii="Times New Roman" w:hAnsi="Times New Roman" w:cs="Times New Roman"/>
+        </w:rPr>
+        <w:t>un MODEL</w:t>
+      </w:r>
+      <w:proofErr w:type="gramEnd"/>
+      <w:r>
+        <w:rPr>
+          <w:rFonts w:ascii="Times New Roman" w:hAnsi="Times New Roman" w:cs="Times New Roman"/>
+        </w:rPr>
+        <w:t xml:space="preserve"> specific se </w:t>
+      </w:r>
+      <w:proofErr w:type="spellStart"/>
+      <w:r>
+        <w:rPr>
+          <w:rFonts w:ascii="Times New Roman" w:hAnsi="Times New Roman" w:cs="Times New Roman"/>
+        </w:rPr>
+        <w:t>poate</w:t>
+      </w:r>
+      <w:proofErr w:type="spellEnd"/>
+      <w:r>
+        <w:rPr>
+          <w:rFonts w:ascii="Times New Roman" w:hAnsi="Times New Roman" w:cs="Times New Roman"/>
+        </w:rPr>
+        <w:t xml:space="preserve"> </w:t>
+      </w:r>
+      <w:proofErr w:type="spellStart"/>
+      <w:r>
+        <w:rPr>
+          <w:rFonts w:ascii="Times New Roman" w:hAnsi="Times New Roman" w:cs="Times New Roman"/>
+        </w:rPr>
+        <w:t>regăsi</w:t>
+      </w:r>
+      <w:proofErr w:type="spellEnd"/>
+      <w:r>
+        <w:rPr>
+          <w:rFonts w:ascii="Times New Roman" w:hAnsi="Times New Roman" w:cs="Times New Roman"/>
+        </w:rPr>
+        <w:t xml:space="preserve"> pe </w:t>
+      </w:r>
+      <w:proofErr w:type="spellStart"/>
+      <w:r>
+        <w:rPr>
+          <w:rFonts w:ascii="Times New Roman" w:hAnsi="Times New Roman" w:cs="Times New Roman"/>
+        </w:rPr>
+        <w:t>mai</w:t>
+      </w:r>
+      <w:proofErr w:type="spellEnd"/>
+      <w:r>
+        <w:rPr>
+          <w:rFonts w:ascii="Times New Roman" w:hAnsi="Times New Roman" w:cs="Times New Roman"/>
+        </w:rPr>
+        <w:t xml:space="preserve"> </w:t>
+      </w:r>
+      <w:proofErr w:type="spellStart"/>
+      <w:r>
+        <w:rPr>
+          <w:rFonts w:ascii="Times New Roman" w:hAnsi="Times New Roman" w:cs="Times New Roman"/>
+        </w:rPr>
+        <w:t>multe</w:t>
+      </w:r>
+      <w:proofErr w:type="spellEnd"/>
+      <w:r>
+        <w:rPr>
+          <w:rFonts w:ascii="Times New Roman" w:hAnsi="Times New Roman" w:cs="Times New Roman"/>
+        </w:rPr>
+        <w:t xml:space="preserve"> </w:t>
+      </w:r>
+      <w:proofErr w:type="spellStart"/>
+      <w:r>
+        <w:rPr>
+          <w:rFonts w:ascii="Times New Roman" w:hAnsi="Times New Roman" w:cs="Times New Roman"/>
+        </w:rPr>
+        <w:t>entități</w:t>
+      </w:r>
+      <w:proofErr w:type="spellEnd"/>
+      <w:r>
+        <w:rPr>
+          <w:rFonts w:ascii="Times New Roman" w:hAnsi="Times New Roman" w:cs="Times New Roman"/>
+        </w:rPr>
+        <w:t xml:space="preserve"> de tip MASINA din </w:t>
+      </w:r>
+      <w:proofErr w:type="spellStart"/>
+      <w:r>
+        <w:rPr>
+          <w:rFonts w:ascii="Times New Roman" w:hAnsi="Times New Roman" w:cs="Times New Roman"/>
+        </w:rPr>
+        <w:t>târg</w:t>
+      </w:r>
+      <w:proofErr w:type="spellEnd"/>
+      <w:r>
+        <w:rPr>
+          <w:rFonts w:ascii="Times New Roman" w:hAnsi="Times New Roman" w:cs="Times New Roman"/>
+        </w:rPr>
+        <w:t xml:space="preserve"> (</w:t>
+      </w:r>
+      <w:proofErr w:type="gramStart"/>
+      <w:r>
+        <w:rPr>
+          <w:rFonts w:ascii="Times New Roman" w:hAnsi="Times New Roman" w:cs="Times New Roman"/>
+        </w:rPr>
+        <w:t>1:N</w:t>
+      </w:r>
+      <w:proofErr w:type="gramEnd"/>
+      <w:r>
+        <w:rPr>
+          <w:rFonts w:ascii="Times New Roman" w:hAnsi="Times New Roman" w:cs="Times New Roman"/>
+        </w:rPr>
+        <w:t>).</w:t>
+      </w:r>
+    </w:p>
+    <w:p>
+      <w:pPr>
+        <w:rPr>
+          <w:rFonts w:ascii="Times New Roman" w:hAnsi="Times New Roman" w:cs="Times New Roman"/>
+        </w:rPr>
+      </w:pPr>
+      <w:proofErr w:type="spellStart"/>
+      <w:r>
+        <w:rPr>
+          <w:rFonts w:ascii="Times New Roman" w:hAnsi="Times New Roman" w:cs="Times New Roman"/>
+        </w:rPr>
+        <w:t>Echipările</w:t>
+      </w:r>
+      <w:proofErr w:type="spellEnd"/>
+      <w:r>
+        <w:rPr>
+          <w:rFonts w:ascii="Times New Roman" w:hAnsi="Times New Roman" w:cs="Times New Roman"/>
+        </w:rPr>
+        <w:t xml:space="preserve"> </w:t>
+      </w:r>
+      <w:proofErr w:type="spellStart"/>
+      <w:r>
+        <w:rPr>
+          <w:rFonts w:ascii="Times New Roman" w:hAnsi="Times New Roman" w:cs="Times New Roman"/>
+        </w:rPr>
+        <w:t>vehiculelor</w:t>
+      </w:r>
+      <w:proofErr w:type="spellEnd"/>
+      <w:r>
+        <w:rPr>
+          <w:rFonts w:ascii="Times New Roman" w:hAnsi="Times New Roman" w:cs="Times New Roman"/>
+        </w:rPr>
+        <w:t xml:space="preserve"> (MASINA - DOTARE): O MASINA are </w:t>
+      </w:r>
+      <w:proofErr w:type="spellStart"/>
+      <w:r>
+        <w:rPr>
+          <w:rFonts w:ascii="Times New Roman" w:hAnsi="Times New Roman" w:cs="Times New Roman"/>
+        </w:rPr>
+        <w:t>în</w:t>
+      </w:r>
+      <w:proofErr w:type="spellEnd"/>
+      <w:r>
+        <w:rPr>
+          <w:rFonts w:ascii="Times New Roman" w:hAnsi="Times New Roman" w:cs="Times New Roman"/>
+        </w:rPr>
+        <w:t xml:space="preserve"> </w:t>
+      </w:r>
+      <w:proofErr w:type="spellStart"/>
+      <w:r>
+        <w:rPr>
+          <w:rFonts w:ascii="Times New Roman" w:hAnsi="Times New Roman" w:cs="Times New Roman"/>
+        </w:rPr>
+        <w:t>componență</w:t>
+      </w:r>
+      <w:proofErr w:type="spellEnd"/>
+      <w:r>
+        <w:rPr>
+          <w:rFonts w:ascii="Times New Roman" w:hAnsi="Times New Roman" w:cs="Times New Roman"/>
+        </w:rPr>
+        <w:t xml:space="preserve"> </w:t>
+      </w:r>
+      <w:proofErr w:type="spellStart"/>
+      <w:r>
+        <w:rPr>
+          <w:rFonts w:ascii="Times New Roman" w:hAnsi="Times New Roman" w:cs="Times New Roman"/>
+        </w:rPr>
+        <w:t>mai</w:t>
+      </w:r>
+      <w:proofErr w:type="spellEnd"/>
+      <w:r>
+        <w:rPr>
+          <w:rFonts w:ascii="Times New Roman" w:hAnsi="Times New Roman" w:cs="Times New Roman"/>
+        </w:rPr>
+        <w:t xml:space="preserve"> </w:t>
+      </w:r>
+      <w:proofErr w:type="spellStart"/>
+      <w:r>
+        <w:rPr>
+          <w:rFonts w:ascii="Times New Roman" w:hAnsi="Times New Roman" w:cs="Times New Roman"/>
+        </w:rPr>
+        <w:t>multe</w:t>
+      </w:r>
+      <w:proofErr w:type="spellEnd"/>
+      <w:r>
+        <w:rPr>
+          <w:rFonts w:ascii="Times New Roman" w:hAnsi="Times New Roman" w:cs="Times New Roman"/>
+        </w:rPr>
+        <w:t xml:space="preserve"> </w:t>
+      </w:r>
+      <w:proofErr w:type="spellStart"/>
+      <w:r>
+        <w:rPr>
+          <w:rFonts w:ascii="Times New Roman" w:hAnsi="Times New Roman" w:cs="Times New Roman"/>
+        </w:rPr>
+        <w:t>entități</w:t>
+      </w:r>
+      <w:proofErr w:type="spellEnd"/>
+      <w:r>
+        <w:rPr>
+          <w:rFonts w:ascii="Times New Roman" w:hAnsi="Times New Roman" w:cs="Times New Roman"/>
+        </w:rPr>
+        <w:t xml:space="preserve"> de tip DOTARE, </w:t>
+      </w:r>
+      <w:proofErr w:type="spellStart"/>
+      <w:r>
+        <w:rPr>
+          <w:rFonts w:ascii="Times New Roman" w:hAnsi="Times New Roman" w:cs="Times New Roman"/>
+        </w:rPr>
+        <w:t>iar</w:t>
+      </w:r>
+      <w:proofErr w:type="spellEnd"/>
+      <w:r>
+        <w:rPr>
+          <w:rFonts w:ascii="Times New Roman" w:hAnsi="Times New Roman" w:cs="Times New Roman"/>
+        </w:rPr>
+        <w:t xml:space="preserve"> o </w:t>
+      </w:r>
+      <w:proofErr w:type="spellStart"/>
+      <w:r>
+        <w:rPr>
+          <w:rFonts w:ascii="Times New Roman" w:hAnsi="Times New Roman" w:cs="Times New Roman"/>
+        </w:rPr>
+        <w:t>anumită</w:t>
+      </w:r>
+      <w:proofErr w:type="spellEnd"/>
+      <w:r>
+        <w:rPr>
+          <w:rFonts w:ascii="Times New Roman" w:hAnsi="Times New Roman" w:cs="Times New Roman"/>
+        </w:rPr>
+        <w:t xml:space="preserve"> DOTARE (ex: "Climatronic") se </w:t>
+      </w:r>
+      <w:proofErr w:type="spellStart"/>
+      <w:r>
+        <w:rPr>
+          <w:rFonts w:ascii="Times New Roman" w:hAnsi="Times New Roman" w:cs="Times New Roman"/>
+        </w:rPr>
+        <w:t>regăsește</w:t>
+      </w:r>
+      <w:proofErr w:type="spellEnd"/>
+      <w:r>
+        <w:rPr>
+          <w:rFonts w:ascii="Times New Roman" w:hAnsi="Times New Roman" w:cs="Times New Roman"/>
+        </w:rPr>
+        <w:t xml:space="preserve"> pe </w:t>
+      </w:r>
+      <w:proofErr w:type="spellStart"/>
+      <w:r>
+        <w:rPr>
+          <w:rFonts w:ascii="Times New Roman" w:hAnsi="Times New Roman" w:cs="Times New Roman"/>
+        </w:rPr>
+        <w:t>mai</w:t>
+      </w:r>
+      <w:proofErr w:type="spellEnd"/>
+      <w:r>
+        <w:rPr>
+          <w:rFonts w:ascii="Times New Roman" w:hAnsi="Times New Roman" w:cs="Times New Roman"/>
+        </w:rPr>
+        <w:t xml:space="preserve"> </w:t>
+      </w:r>
+      <w:proofErr w:type="spellStart"/>
+      <w:r>
+        <w:rPr>
+          <w:rFonts w:ascii="Times New Roman" w:hAnsi="Times New Roman" w:cs="Times New Roman"/>
+        </w:rPr>
+        <w:t>multe</w:t>
+      </w:r>
+      <w:proofErr w:type="spellEnd"/>
+      <w:r>
+        <w:rPr>
+          <w:rFonts w:ascii="Times New Roman" w:hAnsi="Times New Roman" w:cs="Times New Roman"/>
+        </w:rPr>
+        <w:t xml:space="preserve"> </w:t>
+      </w:r>
+      <w:proofErr w:type="spellStart"/>
+      <w:r>
+        <w:rPr>
+          <w:rFonts w:ascii="Times New Roman" w:hAnsi="Times New Roman" w:cs="Times New Roman"/>
+        </w:rPr>
+        <w:t>mașini</w:t>
+      </w:r>
+      <w:proofErr w:type="spellEnd"/>
       <w:r>
         <w:rPr>
           <w:rFonts w:ascii="Times New Roman" w:hAnsi="Times New Roman" w:cs="Times New Roman"/>
         </w:rPr>
         <w:t xml:space="preserve">. </w:t>
       </w:r>
-      <w:r>
-        <w:rPr>
-          <w:rFonts w:ascii="Times New Roman" w:hAnsi="Times New Roman" w:cs="Times New Roman"/>
-        </w:rPr>
-        <w:t>De asemenea, mașinile trebuie să conțină istoricul problemelor tehnice raportate, stocat într-o relație de tip 1 la N.</w:t>
-      </w:r>
-    </w:p>
-    <w:p>
-      <w:pPr>
+      <w:proofErr w:type="spellStart"/>
+      <w:r>
+        <w:rPr>
+          <w:rFonts w:ascii="Times New Roman" w:hAnsi="Times New Roman" w:cs="Times New Roman"/>
+        </w:rPr>
+        <w:t>Aceasta</w:t>
+      </w:r>
+      <w:proofErr w:type="spellEnd"/>
+      <w:r>
+        <w:rPr>
+          <w:rFonts w:ascii="Times New Roman" w:hAnsi="Times New Roman" w:cs="Times New Roman"/>
+        </w:rPr>
+        <w:t xml:space="preserve"> </w:t>
+      </w:r>
+      <w:proofErr w:type="spellStart"/>
+      <w:r>
+        <w:rPr>
+          <w:rFonts w:ascii="Times New Roman" w:hAnsi="Times New Roman" w:cs="Times New Roman"/>
+        </w:rPr>
+        <w:t>generează</w:t>
+      </w:r>
+      <w:proofErr w:type="spellEnd"/>
+      <w:r>
+        <w:rPr>
+          <w:rFonts w:ascii="Times New Roman" w:hAnsi="Times New Roman" w:cs="Times New Roman"/>
+        </w:rPr>
+        <w:t xml:space="preserve"> o </w:t>
+      </w:r>
+      <w:proofErr w:type="spellStart"/>
+      <w:r>
+        <w:rPr>
+          <w:rFonts w:ascii="Times New Roman" w:hAnsi="Times New Roman" w:cs="Times New Roman"/>
+        </w:rPr>
+        <w:t>asocieriere</w:t>
+      </w:r>
+      <w:proofErr w:type="spellEnd"/>
+      <w:r>
+        <w:rPr>
+          <w:rFonts w:ascii="Times New Roman" w:hAnsi="Times New Roman" w:cs="Times New Roman"/>
+        </w:rPr>
+        <w:t xml:space="preserve"> </w:t>
+      </w:r>
+      <w:proofErr w:type="spellStart"/>
+      <w:r>
+        <w:rPr>
+          <w:rFonts w:ascii="Times New Roman" w:hAnsi="Times New Roman" w:cs="Times New Roman"/>
+        </w:rPr>
+        <w:t>complexă</w:t>
+      </w:r>
+      <w:proofErr w:type="spellEnd"/>
+      <w:r>
+        <w:rPr>
+          <w:rFonts w:ascii="Times New Roman" w:hAnsi="Times New Roman" w:cs="Times New Roman"/>
+        </w:rPr>
+        <w:t xml:space="preserve"> de tip Many-to-Many (</w:t>
+      </w:r>
+      <w:proofErr w:type="gramStart"/>
+      <w:r>
+        <w:rPr>
+          <w:rFonts w:ascii="Times New Roman" w:hAnsi="Times New Roman" w:cs="Times New Roman"/>
+        </w:rPr>
+        <w:t>M:N</w:t>
+      </w:r>
+      <w:proofErr w:type="gramEnd"/>
+      <w:r>
+        <w:rPr>
+          <w:rFonts w:ascii="Times New Roman" w:hAnsi="Times New Roman" w:cs="Times New Roman"/>
+        </w:rPr>
+        <w:t xml:space="preserve">) </w:t>
+      </w:r>
+      <w:proofErr w:type="spellStart"/>
+      <w:r>
+        <w:rPr>
+          <w:rFonts w:ascii="Times New Roman" w:hAnsi="Times New Roman" w:cs="Times New Roman"/>
+        </w:rPr>
+        <w:t>în</w:t>
+      </w:r>
+      <w:proofErr w:type="spellEnd"/>
+      <w:r>
+        <w:rPr>
+          <w:rFonts w:ascii="Times New Roman" w:hAnsi="Times New Roman" w:cs="Times New Roman"/>
+        </w:rPr>
+        <w:t xml:space="preserve"> </w:t>
+      </w:r>
+      <w:proofErr w:type="spellStart"/>
+      <w:r>
+        <w:rPr>
+          <w:rFonts w:ascii="Times New Roman" w:hAnsi="Times New Roman" w:cs="Times New Roman"/>
+        </w:rPr>
+        <w:t>modelul</w:t>
+      </w:r>
+      <w:proofErr w:type="spellEnd"/>
+      <w:r>
+        <w:rPr>
+          <w:rFonts w:ascii="Times New Roman" w:hAnsi="Times New Roman" w:cs="Times New Roman"/>
+        </w:rPr>
+        <w:t xml:space="preserve"> conceptual.</w:t>
+      </w:r>
+    </w:p>
+    <w:p>
+      <w:pPr>
+        <w:rPr>
+          <w:rFonts w:ascii="Times New Roman" w:hAnsi="Times New Roman" w:cs="Times New Roman"/>
+        </w:rPr>
+      </w:pPr>
+      <w:proofErr w:type="spellStart"/>
+      <w:r>
+        <w:rPr>
+          <w:rFonts w:ascii="Times New Roman" w:hAnsi="Times New Roman" w:cs="Times New Roman"/>
+        </w:rPr>
+        <w:t>Evidența</w:t>
+      </w:r>
+      <w:proofErr w:type="spellEnd"/>
+      <w:r>
+        <w:rPr>
+          <w:rFonts w:ascii="Times New Roman" w:hAnsi="Times New Roman" w:cs="Times New Roman"/>
+        </w:rPr>
+        <w:t xml:space="preserve"> </w:t>
+      </w:r>
+      <w:proofErr w:type="spellStart"/>
+      <w:r>
+        <w:rPr>
+          <w:rFonts w:ascii="Times New Roman" w:hAnsi="Times New Roman" w:cs="Times New Roman"/>
+        </w:rPr>
+        <w:t>tehnică</w:t>
+      </w:r>
+      <w:proofErr w:type="spellEnd"/>
+      <w:r>
+        <w:rPr>
+          <w:rFonts w:ascii="Times New Roman" w:hAnsi="Times New Roman" w:cs="Times New Roman"/>
+        </w:rPr>
+        <w:t xml:space="preserve"> (MASINA - ISTORIC_PROBLEME): O MASINA </w:t>
+      </w:r>
+      <w:proofErr w:type="spellStart"/>
+      <w:r>
+        <w:rPr>
+          <w:rFonts w:ascii="Times New Roman" w:hAnsi="Times New Roman" w:cs="Times New Roman"/>
+        </w:rPr>
+        <w:t>poate</w:t>
+      </w:r>
+      <w:proofErr w:type="spellEnd"/>
+      <w:r>
+        <w:rPr>
+          <w:rFonts w:ascii="Times New Roman" w:hAnsi="Times New Roman" w:cs="Times New Roman"/>
+        </w:rPr>
+        <w:t xml:space="preserve"> </w:t>
+      </w:r>
+      <w:proofErr w:type="spellStart"/>
+      <w:r>
+        <w:rPr>
+          <w:rFonts w:ascii="Times New Roman" w:hAnsi="Times New Roman" w:cs="Times New Roman"/>
+        </w:rPr>
+        <w:t>avea</w:t>
+      </w:r>
+      <w:proofErr w:type="spellEnd"/>
+      <w:r>
+        <w:rPr>
+          <w:rFonts w:ascii="Times New Roman" w:hAnsi="Times New Roman" w:cs="Times New Roman"/>
+        </w:rPr>
+        <w:t xml:space="preserve"> </w:t>
+      </w:r>
+      <w:proofErr w:type="spellStart"/>
+      <w:r>
+        <w:rPr>
+          <w:rFonts w:ascii="Times New Roman" w:hAnsi="Times New Roman" w:cs="Times New Roman"/>
+        </w:rPr>
+        <w:t>asociate</w:t>
+      </w:r>
+      <w:proofErr w:type="spellEnd"/>
+      <w:r>
+        <w:rPr>
+          <w:rFonts w:ascii="Times New Roman" w:hAnsi="Times New Roman" w:cs="Times New Roman"/>
+        </w:rPr>
+        <w:t xml:space="preserve"> zero, </w:t>
+      </w:r>
+      <w:proofErr w:type="spellStart"/>
+      <w:r>
+        <w:rPr>
+          <w:rFonts w:ascii="Times New Roman" w:hAnsi="Times New Roman" w:cs="Times New Roman"/>
+        </w:rPr>
+        <w:t>una</w:t>
+      </w:r>
+      <w:proofErr w:type="spellEnd"/>
+      <w:r>
+        <w:rPr>
+          <w:rFonts w:ascii="Times New Roman" w:hAnsi="Times New Roman" w:cs="Times New Roman"/>
+        </w:rPr>
+        <w:t xml:space="preserve"> </w:t>
+      </w:r>
+      <w:proofErr w:type="spellStart"/>
+      <w:r>
+        <w:rPr>
+          <w:rFonts w:ascii="Times New Roman" w:hAnsi="Times New Roman" w:cs="Times New Roman"/>
+        </w:rPr>
+        <w:t>sau</w:t>
+      </w:r>
+      <w:proofErr w:type="spellEnd"/>
+      <w:r>
+        <w:rPr>
+          <w:rFonts w:ascii="Times New Roman" w:hAnsi="Times New Roman" w:cs="Times New Roman"/>
+        </w:rPr>
+        <w:t xml:space="preserve"> </w:t>
+      </w:r>
+      <w:proofErr w:type="spellStart"/>
+      <w:r>
+        <w:rPr>
+          <w:rFonts w:ascii="Times New Roman" w:hAnsi="Times New Roman" w:cs="Times New Roman"/>
+        </w:rPr>
+        <w:t>mai</w:t>
+      </w:r>
+      <w:proofErr w:type="spellEnd"/>
+      <w:r>
+        <w:rPr>
+          <w:rFonts w:ascii="Times New Roman" w:hAnsi="Times New Roman" w:cs="Times New Roman"/>
+        </w:rPr>
+        <w:t xml:space="preserve"> </w:t>
+      </w:r>
+      <w:proofErr w:type="spellStart"/>
+      <w:r>
+        <w:rPr>
+          <w:rFonts w:ascii="Times New Roman" w:hAnsi="Times New Roman" w:cs="Times New Roman"/>
+        </w:rPr>
+        <w:t>multe</w:t>
+      </w:r>
+      <w:proofErr w:type="spellEnd"/>
+      <w:r>
+        <w:rPr>
+          <w:rFonts w:ascii="Times New Roman" w:hAnsi="Times New Roman" w:cs="Times New Roman"/>
+        </w:rPr>
+        <w:t xml:space="preserve"> </w:t>
+      </w:r>
+      <w:proofErr w:type="spellStart"/>
+      <w:r>
+        <w:rPr>
+          <w:rFonts w:ascii="Times New Roman" w:hAnsi="Times New Roman" w:cs="Times New Roman"/>
+        </w:rPr>
+        <w:t>înregistrări</w:t>
+      </w:r>
+      <w:proofErr w:type="spellEnd"/>
+      <w:r>
+        <w:rPr>
+          <w:rFonts w:ascii="Times New Roman" w:hAnsi="Times New Roman" w:cs="Times New Roman"/>
+        </w:rPr>
+        <w:t xml:space="preserve"> </w:t>
+      </w:r>
+      <w:proofErr w:type="spellStart"/>
+      <w:r>
+        <w:rPr>
+          <w:rFonts w:ascii="Times New Roman" w:hAnsi="Times New Roman" w:cs="Times New Roman"/>
+        </w:rPr>
+        <w:t>în</w:t>
+      </w:r>
+      <w:proofErr w:type="spellEnd"/>
+      <w:r>
+        <w:rPr>
+          <w:rFonts w:ascii="Times New Roman" w:hAnsi="Times New Roman" w:cs="Times New Roman"/>
+        </w:rPr>
+        <w:t xml:space="preserve"> ISTORIC_PROBLEME (</w:t>
+      </w:r>
+      <w:proofErr w:type="spellStart"/>
+      <w:r>
+        <w:rPr>
+          <w:rFonts w:ascii="Times New Roman" w:hAnsi="Times New Roman" w:cs="Times New Roman"/>
+        </w:rPr>
+        <w:t>Relație</w:t>
+      </w:r>
+      <w:proofErr w:type="spellEnd"/>
+      <w:r>
+        <w:rPr>
+          <w:rFonts w:ascii="Times New Roman" w:hAnsi="Times New Roman" w:cs="Times New Roman"/>
+        </w:rPr>
+        <w:t xml:space="preserve"> </w:t>
+      </w:r>
+      <w:proofErr w:type="gramStart"/>
+      <w:r>
+        <w:rPr>
+          <w:rFonts w:ascii="Times New Roman" w:hAnsi="Times New Roman" w:cs="Times New Roman"/>
+        </w:rPr>
+        <w:t>1:N</w:t>
+      </w:r>
+      <w:proofErr w:type="gramEnd"/>
+      <w:r>
+        <w:rPr>
+          <w:rFonts w:ascii="Times New Roman" w:hAnsi="Times New Roman" w:cs="Times New Roman"/>
+        </w:rPr>
+        <w:t>).</w:t>
+      </w:r>
+    </w:p>
+    <w:p>
+      <w:pPr>
+        <w:jc w:val="center"/>
+        <w:rPr>
+          <w:rStyle w:val="Heading1Char"/>
+          <w:rFonts w:ascii="Times New Roman" w:hAnsi="Times New Roman" w:cs="Times New Roman"/>
+        </w:rPr>
+      </w:pPr>
+    </w:p>
+    <w:p>
+      <w:pPr>
+        <w:jc w:val="center"/>
+        <w:rPr>
+          <w:rStyle w:val="Heading1Char"/>
+          <w:rFonts w:ascii="Times New Roman" w:hAnsi="Times New Roman" w:cs="Times New Roman"/>
+        </w:rPr>
+      </w:pPr>
+      <w:proofErr w:type="spellStart"/>
+      <w:r>
+        <w:rPr>
+          <w:rStyle w:val="Heading1Char"/>
+          <w:rFonts w:ascii="Times New Roman" w:hAnsi="Times New Roman" w:cs="Times New Roman"/>
+        </w:rPr>
+        <w:t>Diagrama</w:t>
+      </w:r>
+      <w:proofErr w:type="spellEnd"/>
+      <w:r>
+        <w:rPr>
+          <w:rStyle w:val="Heading1Char"/>
+          <w:rFonts w:ascii="Times New Roman" w:hAnsi="Times New Roman" w:cs="Times New Roman"/>
+        </w:rPr>
+        <w:t xml:space="preserve"> ER</w:t>
+      </w:r>
+    </w:p>
+    <w:p>
+      <w:pPr>
+        <w:jc w:val="center"/>
+        <w:rPr>
+          <w:rStyle w:val="Heading1Char"/>
+          <w:rFonts w:ascii="Times New Roman" w:hAnsi="Times New Roman" w:cs="Times New Roman"/>
+        </w:rPr>
+      </w:pPr>
+    </w:p>
+    <w:p>
+      <w:pPr>
+        <w:jc w:val="center"/>
+        <w:rPr>
+          <w:rStyle w:val="Heading1Char"/>
+          <w:rFonts w:ascii="Times New Roman" w:hAnsi="Times New Roman" w:cs="Times New Roman"/>
+        </w:rPr>
+      </w:pPr>
+    </w:p>
+    <w:p>
+      <w:pPr>
+        <w:jc w:val="center"/>
+        <w:rPr>
+          <w:rStyle w:val="Heading1Char"/>
+          <w:rFonts w:ascii="Times New Roman" w:hAnsi="Times New Roman" w:cs="Times New Roman"/>
+        </w:rPr>
+      </w:pPr>
+    </w:p>
+    <w:p>
+      <w:pPr>
+        <w:jc w:val="center"/>
+        <w:rPr>
+          <w:rStyle w:val="Heading1Char"/>
+          <w:rFonts w:ascii="Times New Roman" w:hAnsi="Times New Roman" w:cs="Times New Roman"/>
+        </w:rPr>
+      </w:pPr>
+    </w:p>
+    <w:p>
+      <w:pPr>
+        <w:rPr>
+          <w:rStyle w:val="Heading1Char"/>
+          <w:rFonts w:ascii="Times New Roman" w:hAnsi="Times New Roman" w:cs="Times New Roman"/>
+        </w:rPr>
+      </w:pPr>
+      <w:r>
+        <w:rPr>
+          <w:noProof/>
+        </w:rPr>
+        <w:drawing>
+          <wp:inline distT="0" distB="0" distL="0" distR="0" wp14:anchorId="4EE90E24" wp14:editId="3FB14B34">
+            <wp:extent cx="6787788" cy="3544676"/>
+            <wp:effectExtent l="0" t="0" r="0" b="0"/>
+            <wp:docPr id="1929144031" name="Picture 1"/>
+            <wp:cNvGraphicFramePr>
+              <a:graphicFrameLocks xmlns:a="http://schemas.openxmlformats.org/drawingml/2006/main" noChangeAspect="1"/>
+            </wp:cNvGraphicFramePr>
+            <a:graphic xmlns:a="http://schemas.openxmlformats.org/drawingml/2006/main">
+              <a:graphicData uri="http://schemas.openxmlformats.org/drawingml/2006/picture">
+                <pic:pic xmlns:pic="http://schemas.openxmlformats.org/drawingml/2006/picture">
+                  <pic:nvPicPr>
+                    <pic:cNvPr id="0" name="Picture 1"/>
+                    <pic:cNvPicPr>
+                      <a:picLocks noChangeAspect="1" noChangeArrowheads="1"/>
+                    </pic:cNvPicPr>
+                  </pic:nvPicPr>
+                  <pic:blipFill>
+                    <a:blip r:embed="rId8" cstate="print">
+                      <a:extLst>
+                        <a:ext uri="{28A0092B-C50C-407E-A947-70E740481C1C}">
+                          <a14:useLocalDpi xmlns:a14="http://schemas.microsoft.com/office/drawing/2010/main" val="0"/>
+                        </a:ext>
+                      </a:extLst>
+                    </a:blip>
+                    <a:srcRect/>
+                    <a:stretch>
+                      <a:fillRect/>
+                    </a:stretch>
+                  </pic:blipFill>
+                  <pic:spPr bwMode="auto">
+                    <a:xfrm>
+                      <a:off x="0" y="0"/>
+                      <a:ext cx="6810867" cy="3556728"/>
+                    </a:xfrm>
+                    <a:prstGeom prst="rect">
+                      <a:avLst/>
+                    </a:prstGeom>
+                    <a:noFill/>
+                    <a:ln>
+                      <a:noFill/>
+                    </a:ln>
+                  </pic:spPr>
+                </pic:pic>
+              </a:graphicData>
+            </a:graphic>
+          </wp:inline>
+        </w:drawing>
+      </w:r>
+    </w:p>
+    <w:p>
+      <w:pPr>
+        <w:jc w:val="center"/>
         <w:rPr>
           <w:sz w:val="36"/>
           <w:szCs w:val="36"/>
         </w:rPr>
       </w:pPr>
-      <w:r>
+    </w:p>
+    <w:p>
+      <w:pPr>
+        <w:jc w:val="center"/>
         <w:rPr>
           <w:sz w:val="36"/>
           <w:szCs w:val="36"/>
         </w:rPr>
-        <w:br w:type="page"/>
-      </w:r>
-    </w:p>
-    <w:p>
-      <w:pPr>
-        <w:spacing w:before="30"/>
+      </w:pPr>
+    </w:p>
+    <w:p>
+      <w:pPr>
         <w:jc w:val="center"/>
         <w:rPr>
           <w:sz w:val="36"/>
@@ -1190,7 +4677,23 @@
     </w:p>
     <w:p>
       <w:pPr>
-        <w:spacing w:before="30"/>
+        <w:pStyle w:val="Heading1"/>
+        <w:jc w:val="center"/>
+      </w:pPr>
+      <w:proofErr w:type="spellStart"/>
+      <w:r>
+        <w:lastRenderedPageBreak/>
+        <w:t>Diagrama</w:t>
+      </w:r>
+      <w:proofErr w:type="spellEnd"/>
+      <w:r>
+        <w:t xml:space="preserve"> DB</w:t>
+      </w:r>
+    </w:p>
+    <w:p/>
+    <w:p/>
+    <w:p>
+      <w:pPr>
         <w:jc w:val="center"/>
         <w:rPr>
           <w:sz w:val="36"/>
@@ -1201,11 +4704,10 @@
         <w:rPr>
           <w:noProof/>
         </w:rPr>
-        <w:lastRenderedPageBreak/>
         <w:drawing>
-          <wp:inline distT="0" distB="0" distL="0" distR="0" wp14:anchorId="6E664BAF" wp14:editId="522D48DE">
-            <wp:extent cx="5854065" cy="8261985"/>
-            <wp:effectExtent l="0" t="0" r="0" b="5715"/>
+          <wp:inline distT="0" distB="0" distL="0" distR="0" wp14:anchorId="00919A94" wp14:editId="3EBE2704">
+            <wp:extent cx="5192202" cy="6606585"/>
+            <wp:effectExtent l="0" t="0" r="8890" b="3810"/>
             <wp:docPr id="717865007" name="Picture 1"/>
             <wp:cNvGraphicFramePr>
               <a:graphicFrameLocks xmlns:a="http://schemas.openxmlformats.org/drawingml/2006/main" noChangeAspect="1"/>
@@ -1220,7 +4722,7 @@
                     </pic:cNvPicPr>
                   </pic:nvPicPr>
                   <pic:blipFill>
-                    <a:blip r:embed="rId8">
+                    <a:blip r:embed="rId9">
                       <a:extLst>
                         <a:ext uri="{28A0092B-C50C-407E-A947-70E740481C1C}">
                           <a14:useLocalDpi xmlns:a14="http://schemas.microsoft.com/office/drawing/2010/main" val="0"/>
@@ -1235,7 +4737,7 @@
                   <pic:spPr bwMode="auto">
                     <a:xfrm>
                       <a:off x="0" y="0"/>
-                      <a:ext cx="5854065" cy="8261985"/>
+                      <a:ext cx="5238278" cy="6665212"/>
                     </a:xfrm>
                     <a:prstGeom prst="rect">
                       <a:avLst/>
@@ -1251,51 +4753,16 @@
           </wp:inline>
         </w:drawing>
       </w:r>
-    </w:p>
-    <w:p>
-      <w:pPr>
+      <w:r>
         <w:rPr>
           <w:sz w:val="36"/>
           <w:szCs w:val="36"/>
         </w:rPr>
-      </w:pPr>
-      <w:r>
-        <w:rPr>
-          <w:sz w:val="36"/>
-          <w:szCs w:val="36"/>
-        </w:rPr>
-        <w:lastRenderedPageBreak/>
         <w:br w:type="page"/>
       </w:r>
     </w:p>
-    <w:p>
-      <w:pPr>
-        <w:rPr>
-          <w:sz w:val="36"/>
-          <w:szCs w:val="36"/>
-        </w:rPr>
-      </w:pPr>
-      <w:r>
-        <w:rPr>
-          <w:sz w:val="36"/>
-          <w:szCs w:val="36"/>
-        </w:rPr>
-        <w:lastRenderedPageBreak/>
-        <w:br w:type="page"/>
-      </w:r>
-    </w:p>
-    <w:p>
-      <w:pPr>
-        <w:spacing w:before="30"/>
-        <w:jc w:val="center"/>
-        <w:rPr>
-          <w:sz w:val="36"/>
-          <w:szCs w:val="36"/>
-        </w:rPr>
-      </w:pPr>
-    </w:p>
     <w:sectPr>
-      <w:footerReference w:type="default" r:id="rId9"/>
+      <w:footerReference w:type="default" r:id="rId10"/>
       <w:pgSz w:w="12240" w:h="15840"/>
       <w:pgMar w:top="1418" w:right="1418" w:bottom="1411" w:left="1418" w:header="720" w:footer="720" w:gutter="0"/>
       <w:cols w:space="720"/>

</xml_diff>